<commit_message>
Added animation, though this looks kinda bad, might change the animation.
</commit_message>
<xml_diff>
--- a/GDD/Document1.docx
+++ b/GDD/Document1.docx
@@ -55,6 +55,12 @@
           <w:strike/>
         </w:rPr>
         <w:t xml:space="preserve">chơi???????</w:t>
+      </w:r>
+      <w:r>
+        <w:rPr>
+          <w:strike/>
+          <w:highlight w:val="none"/>
+        </w:rPr>
       </w:r>
       <w:r>
         <w:rPr>
@@ -580,6 +586,12 @@
           <w:highlight w:val="none"/>
         </w:rPr>
       </w:r>
+      <w:r>
+        <w:rPr>
+          <w:strike/>
+          <w:highlight w:val="none"/>
+        </w:rPr>
+      </w:r>
     </w:p>
     <w:p>
       <w:pPr>
@@ -604,6 +616,12 @@
         </w:rPr>
         <w:t xml:space="preserve">FUCK THOSE. The idea was way too out of my skill so i think ill just make a game in a genre that defines the whole game-play. So first thing that pops up in my head is shoot em up games. Just a basic game that do not try to reinvent the wheel.</w:t>
         <w:br/>
+      </w:r>
+      <w:r>
+        <w:rPr>
+          <w:strike w:val="0"/>
+          <w:highlight w:val="none"/>
+        </w:rPr>
       </w:r>
       <w:r>
         <w:rPr>
@@ -657,6 +675,16 @@
           <w:highlight w:val="none"/>
         </w:rPr>
       </w:r>
+      <w:r>
+        <w:rPr>
+          <w:b/>
+          <w:bCs/>
+          <w:strike w:val="0"/>
+          <w:sz w:val="36"/>
+          <w:szCs w:val="36"/>
+          <w:highlight w:val="none"/>
+        </w:rPr>
+      </w:r>
     </w:p>
     <w:p>
       <w:pPr>
@@ -683,6 +711,16 @@
           <w:highlight w:val="none"/>
         </w:rPr>
         <w:t xml:space="preserve">1. Concept:</w:t>
+      </w:r>
+      <w:r>
+        <w:rPr>
+          <w:b/>
+          <w:bCs/>
+          <w:strike w:val="0"/>
+          <w:sz w:val="28"/>
+          <w:szCs w:val="28"/>
+          <w:highlight w:val="none"/>
+        </w:rPr>
       </w:r>
       <w:r>
         <w:rPr>
@@ -734,6 +772,14 @@
           <w:highlight w:val="none"/>
         </w:rPr>
       </w:r>
+      <w:r>
+        <w:rPr>
+          <w:strike w:val="0"/>
+          <w:sz w:val="24"/>
+          <w:szCs w:val="24"/>
+          <w:highlight w:val="none"/>
+        </w:rPr>
+      </w:r>
     </w:p>
     <w:p>
       <w:pPr>
@@ -771,6 +817,16 @@
           <w:highlight w:val="none"/>
         </w:rPr>
       </w:r>
+      <w:r>
+        <w:rPr>
+          <w:b/>
+          <w:bCs/>
+          <w:strike w:val="0"/>
+          <w:sz w:val="28"/>
+          <w:szCs w:val="28"/>
+          <w:highlight w:val="none"/>
+        </w:rPr>
+      </w:r>
     </w:p>
     <w:p>
       <w:pPr>
@@ -802,6 +858,14 @@
           <w:highlight w:val="none"/>
         </w:rPr>
       </w:r>
+      <w:r>
+        <w:rPr>
+          <w:strike w:val="0"/>
+          <w:sz w:val="24"/>
+          <w:szCs w:val="24"/>
+          <w:highlight w:val="none"/>
+        </w:rPr>
+      </w:r>
     </w:p>
     <w:p>
       <w:pPr>
@@ -828,6 +892,16 @@
           <w:highlight w:val="none"/>
         </w:rPr>
         <w:t xml:space="preserve">Game structure:</w:t>
+      </w:r>
+      <w:r>
+        <w:rPr>
+          <w:b/>
+          <w:bCs/>
+          <w:strike w:val="0"/>
+          <w:sz w:val="28"/>
+          <w:szCs w:val="28"/>
+          <w:highlight w:val="none"/>
+        </w:rPr>
       </w:r>
       <w:r>
         <w:rPr>
@@ -904,6 +978,16 @@
           <w:highlight w:val="none"/>
         </w:rPr>
         <w:t xml:space="preserve">Players:</w:t>
+      </w:r>
+      <w:r>
+        <w:rPr>
+          <w:b/>
+          <w:bCs/>
+          <w:strike w:val="0"/>
+          <w:sz w:val="28"/>
+          <w:szCs w:val="28"/>
+          <w:highlight w:val="none"/>
+        </w:rPr>
       </w:r>
       <w:r>
         <w:rPr>
@@ -999,6 +1083,16 @@
           <w:highlight w:val="none"/>
         </w:rPr>
       </w:r>
+      <w:r>
+        <w:rPr>
+          <w:b/>
+          <w:bCs/>
+          <w:strike w:val="0"/>
+          <w:sz w:val="28"/>
+          <w:szCs w:val="28"/>
+          <w:highlight w:val="none"/>
+        </w:rPr>
+      </w:r>
     </w:p>
     <w:p>
       <w:pPr>
@@ -1083,6 +1177,16 @@
           <w:highlight w:val="none"/>
         </w:rPr>
       </w:r>
+      <w:r>
+        <w:rPr>
+          <w:b/>
+          <w:bCs/>
+          <w:strike w:val="0"/>
+          <w:sz w:val="28"/>
+          <w:szCs w:val="28"/>
+          <w:highlight w:val="none"/>
+        </w:rPr>
+      </w:r>
     </w:p>
     <w:p>
       <w:pPr>
@@ -1120,6 +1224,16 @@
           <w:highlight w:val="none"/>
         </w:rPr>
       </w:r>
+      <w:r>
+        <w:rPr>
+          <w:b w:val="0"/>
+          <w:bCs w:val="0"/>
+          <w:strike w:val="0"/>
+          <w:sz w:val="24"/>
+          <w:szCs w:val="24"/>
+          <w:highlight w:val="none"/>
+        </w:rPr>
+      </w:r>
     </w:p>
     <w:p>
       <w:pPr>
@@ -1157,10 +1271,20 @@
           <w:highlight w:val="none"/>
         </w:rPr>
       </w:r>
+      <w:r>
+        <w:rPr>
+          <w:b/>
+          <w:bCs/>
+          <w:strike w:val="0"/>
+          <w:sz w:val="28"/>
+          <w:szCs w:val="28"/>
+          <w:highlight w:val="none"/>
+        </w:rPr>
+      </w:r>
     </w:p>
     <w:p>
       <w:pPr>
-        <w:pStyle w:val="890"/>
+        <w:pStyle w:val="906"/>
         <w:numPr>
           <w:ilvl w:val="0"/>
           <w:numId w:val="8"/>
@@ -1199,10 +1323,20 @@
           <w:highlight w:val="none"/>
         </w:rPr>
       </w:r>
+      <w:r>
+        <w:rPr>
+          <w:b w:val="0"/>
+          <w:bCs w:val="0"/>
+          <w:strike w:val="0"/>
+          <w:sz w:val="24"/>
+          <w:szCs w:val="24"/>
+          <w:highlight w:val="none"/>
+        </w:rPr>
+      </w:r>
     </w:p>
     <w:p>
       <w:pPr>
-        <w:pStyle w:val="890"/>
+        <w:pStyle w:val="906"/>
         <w:numPr>
           <w:ilvl w:val="0"/>
           <w:numId w:val="8"/>
@@ -1297,6 +1431,16 @@
           <w:highlight w:val="none"/>
         </w:rPr>
       </w:r>
+      <w:r>
+        <w:rPr>
+          <w:b/>
+          <w:bCs/>
+          <w:strike w:val="0"/>
+          <w:sz w:val="36"/>
+          <w:szCs w:val="36"/>
+          <w:highlight w:val="none"/>
+        </w:rPr>
+      </w:r>
     </w:p>
     <w:p>
       <w:pPr>
@@ -1327,36 +1471,6 @@
           <w:highlight w:val="none"/>
         </w:rPr>
       </w:r>
-    </w:p>
-    <w:p>
-      <w:pPr>
-        <w:pBdr/>
-        <w:spacing/>
-        <w:ind w:firstLine="0" w:left="0"/>
-        <w:rPr>
-          <w:strike w:val="0"/>
-          <w:sz w:val="28"/>
-          <w:szCs w:val="28"/>
-          <w:highlight w:val="none"/>
-        </w:rPr>
-      </w:pPr>
-      <w:r>
-        <w:rPr>
-          <w:strike w:val="0"/>
-          <w:sz w:val="28"/>
-          <w:szCs w:val="28"/>
-          <w:highlight w:val="none"/>
-        </w:rPr>
-      </w:r>
-      <w:r>
-        <w:rPr>
-          <w:strike w:val="0"/>
-          <w:sz w:val="28"/>
-          <w:szCs w:val="28"/>
-          <w:highlight w:val="none"/>
-        </w:rPr>
-        <w:t xml:space="preserve">There will be one map of just a level</w:t>
-      </w:r>
       <w:r>
         <w:rPr>
           <w:strike w:val="0"/>
@@ -1373,6 +1487,52 @@
         <w:ind w:firstLine="0" w:left="0"/>
         <w:rPr>
           <w:strike w:val="0"/>
+          <w:sz w:val="24"/>
+          <w:szCs w:val="24"/>
+          <w:highlight w:val="none"/>
+        </w:rPr>
+      </w:pPr>
+      <w:r>
+        <w:rPr>
+          <w:strike w:val="0"/>
+          <w:sz w:val="24"/>
+          <w:szCs w:val="24"/>
+          <w:highlight w:val="none"/>
+        </w:rPr>
+      </w:r>
+      <w:r>
+        <w:rPr>
+          <w:strike w:val="0"/>
+          <w:sz w:val="24"/>
+          <w:szCs w:val="24"/>
+          <w:highlight w:val="none"/>
+        </w:rPr>
+        <w:t xml:space="preserve">There will be one map of just a level</w:t>
+      </w:r>
+      <w:r>
+        <w:rPr>
+          <w:strike w:val="0"/>
+          <w:sz w:val="24"/>
+          <w:szCs w:val="24"/>
+          <w:highlight w:val="none"/>
+        </w:rPr>
+      </w:r>
+      <w:r>
+        <w:rPr>
+          <w:strike w:val="0"/>
+          <w:sz w:val="24"/>
+          <w:szCs w:val="24"/>
+          <w:highlight w:val="none"/>
+        </w:rPr>
+      </w:r>
+    </w:p>
+    <w:p>
+      <w:pPr>
+        <w:pBdr/>
+        <w:spacing/>
+        <w:ind w:firstLine="0" w:left="0"/>
+        <w:rPr>
+          <w:strike w:val="0"/>
           <w:sz w:val="28"/>
           <w:szCs w:val="28"/>
           <w:highlight w:val="none"/>
@@ -1386,6 +1546,14 @@
           <w:highlight w:val="none"/>
         </w:rPr>
         <w:t xml:space="preserve">Landscape:</w:t>
+      </w:r>
+      <w:r>
+        <w:rPr>
+          <w:strike w:val="0"/>
+          <w:sz w:val="28"/>
+          <w:szCs w:val="28"/>
+          <w:highlight w:val="none"/>
+        </w:rPr>
       </w:r>
       <w:r>
         <w:rPr>
@@ -1462,6 +1630,14 @@
           <w:highlight w:val="none"/>
         </w:rPr>
       </w:r>
+      <w:r>
+        <w:rPr>
+          <w:strike w:val="0"/>
+          <w:sz w:val="28"/>
+          <w:szCs w:val="28"/>
+          <w:highlight w:val="none"/>
+        </w:rPr>
+      </w:r>
     </w:p>
     <w:p>
       <w:pPr>
@@ -1520,6 +1696,14 @@
           <w:highlight w:val="none"/>
         </w:rPr>
         <w:t xml:space="preserve">Object type:</w:t>
+      </w:r>
+      <w:r>
+        <w:rPr>
+          <w:strike w:val="0"/>
+          <w:sz w:val="28"/>
+          <w:szCs w:val="28"/>
+          <w:highlight w:val="none"/>
+        </w:rPr>
       </w:r>
       <w:r>
         <w:rPr>
@@ -1671,72 +1855,66 @@
           <w:highlight w:val="none"/>
         </w:rPr>
       </w:r>
-    </w:p>
-    <w:p>
-      <w:pPr>
-        <w:pBdr/>
-        <w:spacing/>
-        <w:ind w:firstLine="0" w:left="0"/>
-        <w:rPr>
-          <w:strike w:val="0"/>
-          <w:sz w:val="36"/>
-          <w:szCs w:val="36"/>
-          <w:highlight w:val="none"/>
-        </w:rPr>
-      </w:pPr>
       <w:r>
         <w:rPr>
           <w:strike w:val="0"/>
-          <w:sz w:val="36"/>
-          <w:szCs w:val="36"/>
+          <w:sz w:val="28"/>
+          <w:szCs w:val="28"/>
+          <w:highlight w:val="none"/>
+        </w:rPr>
+      </w:r>
+    </w:p>
+    <w:p>
+      <w:pPr>
+        <w:pBdr/>
+        <w:spacing/>
+        <w:ind/>
+        <w:rPr>
+          <w:strike w:val="0"/>
+          <w:sz w:val="28"/>
+          <w:szCs w:val="28"/>
+          <w:highlight w:val="none"/>
+          <w14:ligatures w14:val="none"/>
+        </w:rPr>
+      </w:pPr>
+      <w:r>
+        <w:rPr>
           <w:highlight w:val="none"/>
         </w:rPr>
       </w:r>
       <w:r>
         <w:rPr>
           <w:strike w:val="0"/>
-          <w:sz w:val="36"/>
-          <w:szCs w:val="36"/>
+          <w:sz w:val="28"/>
+          <w:szCs w:val="28"/>
+          <w:highlight w:val="none"/>
+        </w:rPr>
+        <w:t xml:space="preserve">Entities:</w:t>
+      </w:r>
+      <w:r>
+        <w:rPr>
           <w:highlight w:val="none"/>
         </w:rPr>
       </w:r>
+    </w:p>
+    <w:p>
+      <w:pPr>
+        <w:pBdr/>
+        <w:spacing/>
+        <w:ind w:firstLine="0" w:left="0"/>
+        <w:rPr>
+          <w:highlight w:val="none"/>
+          <w14:ligatures w14:val="none"/>
+        </w:rPr>
+      </w:pPr>
       <w:r>
         <w:rPr>
-          <w:strike w:val="0"/>
-          <w:sz w:val="36"/>
-          <w:szCs w:val="36"/>
           <w:highlight w:val="none"/>
         </w:rPr>
+        <w:t xml:space="preserve">Main ship: A ship with advanced technology that was powered by a nuclear reactor. It has 3 modes of shooting that can be changed with ease of a pressing of a button, yes. The ship is triangular shaped with the core at the center. Each mode of shooting is a vertex of the triangle. Each mode has a color to distinguish. Elementary colors are: white, blue and red.</w:t>
       </w:r>
       <w:r>
         <w:rPr>
-          <w:strike w:val="0"/>
-          <w:sz w:val="36"/>
-          <w:szCs w:val="36"/>
-          <w:highlight w:val="none"/>
-        </w:rPr>
-      </w:r>
-      <w:r>
-        <w:rPr>
-          <w:strike w:val="0"/>
-          <w:sz w:val="36"/>
-          <w:szCs w:val="36"/>
-          <w:highlight w:val="none"/>
-        </w:rPr>
-      </w:r>
-      <w:r>
-        <w:rPr>
-          <w:strike w:val="0"/>
-          <w:sz w:val="36"/>
-          <w:szCs w:val="36"/>
-          <w:highlight w:val="none"/>
-        </w:rPr>
-      </w:r>
-      <w:r>
-        <w:rPr>
-          <w:strike w:val="0"/>
-          <w:sz w:val="36"/>
-          <w:szCs w:val="36"/>
           <w:highlight w:val="none"/>
         </w:rPr>
       </w:r>
@@ -3056,9 +3234,9 @@
     <w:lsdException w:name="Bibliography" w:uiPriority="37"/>
     <w:lsdException w:name="TOC Heading" w:uiPriority="39" w:qFormat="1"/>
   </w:latentStyles>
-  <w:style w:type="table" w:styleId="701">
+  <w:style w:type="table" w:styleId="717">
     <w:name w:val="Table Grid"/>
-    <w:basedOn w:val="887"/>
+    <w:basedOn w:val="903"/>
     <w:uiPriority w:val="59"/>
     <w:pPr>
       <w:pBdr/>
@@ -3255,9 +3433,9 @@
       </w:tcPr>
     </w:tblStylePr>
   </w:style>
-  <w:style w:type="table" w:styleId="702">
+  <w:style w:type="table" w:styleId="718">
     <w:name w:val="Table Grid Light"/>
-    <w:basedOn w:val="887"/>
+    <w:basedOn w:val="903"/>
     <w:uiPriority w:val="59"/>
     <w:pPr>
       <w:pBdr/>
@@ -3454,9 +3632,9 @@
       </w:tcPr>
     </w:tblStylePr>
   </w:style>
-  <w:style w:type="table" w:styleId="703">
+  <w:style w:type="table" w:styleId="719">
     <w:name w:val="Plain Table 1"/>
-    <w:basedOn w:val="887"/>
+    <w:basedOn w:val="903"/>
     <w:uiPriority w:val="59"/>
     <w:pPr>
       <w:pBdr/>
@@ -3679,9 +3857,9 @@
       </w:tcPr>
     </w:tblStylePr>
   </w:style>
-  <w:style w:type="table" w:styleId="704">
+  <w:style w:type="table" w:styleId="720">
     <w:name w:val="Plain Table 2"/>
-    <w:basedOn w:val="887"/>
+    <w:basedOn w:val="903"/>
     <w:uiPriority w:val="59"/>
     <w:pPr>
       <w:pBdr/>
@@ -3912,9 +4090,9 @@
       </w:tcPr>
     </w:tblStylePr>
   </w:style>
-  <w:style w:type="table" w:styleId="705">
+  <w:style w:type="table" w:styleId="721">
     <w:name w:val="Plain Table 3"/>
-    <w:basedOn w:val="887"/>
+    <w:basedOn w:val="903"/>
     <w:uiPriority w:val="99"/>
     <w:pPr>
       <w:pBdr/>
@@ -4142,9 +4320,9 @@
       </w:tcPr>
     </w:tblStylePr>
   </w:style>
-  <w:style w:type="table" w:styleId="706">
+  <w:style w:type="table" w:styleId="722">
     <w:name w:val="Plain Table 4"/>
-    <w:basedOn w:val="887"/>
+    <w:basedOn w:val="903"/>
     <w:uiPriority w:val="99"/>
     <w:pPr>
       <w:pBdr/>
@@ -4358,9 +4536,9 @@
       </w:tcPr>
     </w:tblStylePr>
   </w:style>
-  <w:style w:type="table" w:styleId="707">
+  <w:style w:type="table" w:styleId="723">
     <w:name w:val="Plain Table 5"/>
-    <w:basedOn w:val="887"/>
+    <w:basedOn w:val="903"/>
     <w:uiPriority w:val="99"/>
     <w:pPr>
       <w:pBdr/>
@@ -4591,9 +4769,9 @@
       </w:tcPr>
     </w:tblStylePr>
   </w:style>
-  <w:style w:type="table" w:styleId="708">
+  <w:style w:type="table" w:styleId="724">
     <w:name w:val="Grid Table 1 Light"/>
-    <w:basedOn w:val="887"/>
+    <w:basedOn w:val="903"/>
     <w:uiPriority w:val="99"/>
     <w:pPr>
       <w:pBdr/>
@@ -4814,9 +4992,9 @@
       </w:tcPr>
     </w:tblStylePr>
   </w:style>
-  <w:style w:type="table" w:styleId="709">
+  <w:style w:type="table" w:styleId="725">
     <w:name w:val="Grid Table 1 Light - Accent 1"/>
-    <w:basedOn w:val="887"/>
+    <w:basedOn w:val="903"/>
     <w:uiPriority w:val="99"/>
     <w:pPr>
       <w:pBdr/>
@@ -5037,9 +5215,9 @@
       </w:tcPr>
     </w:tblStylePr>
   </w:style>
-  <w:style w:type="table" w:styleId="710">
+  <w:style w:type="table" w:styleId="726">
     <w:name w:val="Grid Table 1 Light - Accent 2"/>
-    <w:basedOn w:val="887"/>
+    <w:basedOn w:val="903"/>
     <w:uiPriority w:val="99"/>
     <w:pPr>
       <w:pBdr/>
@@ -5260,9 +5438,9 @@
       </w:tcPr>
     </w:tblStylePr>
   </w:style>
-  <w:style w:type="table" w:styleId="711">
+  <w:style w:type="table" w:styleId="727">
     <w:name w:val="Grid Table 1 Light - Accent 3"/>
-    <w:basedOn w:val="887"/>
+    <w:basedOn w:val="903"/>
     <w:uiPriority w:val="99"/>
     <w:pPr>
       <w:pBdr/>
@@ -5483,9 +5661,9 @@
       </w:tcPr>
     </w:tblStylePr>
   </w:style>
-  <w:style w:type="table" w:styleId="712">
+  <w:style w:type="table" w:styleId="728">
     <w:name w:val="Grid Table 1 Light - Accent 4"/>
-    <w:basedOn w:val="887"/>
+    <w:basedOn w:val="903"/>
     <w:uiPriority w:val="99"/>
     <w:pPr>
       <w:pBdr/>
@@ -5706,9 +5884,9 @@
       </w:tcPr>
     </w:tblStylePr>
   </w:style>
-  <w:style w:type="table" w:styleId="713">
+  <w:style w:type="table" w:styleId="729">
     <w:name w:val="Grid Table 1 Light - Accent 5"/>
-    <w:basedOn w:val="887"/>
+    <w:basedOn w:val="903"/>
     <w:uiPriority w:val="99"/>
     <w:pPr>
       <w:pBdr/>
@@ -5929,9 +6107,9 @@
       </w:tcPr>
     </w:tblStylePr>
   </w:style>
-  <w:style w:type="table" w:styleId="714">
+  <w:style w:type="table" w:styleId="730">
     <w:name w:val="Grid Table 1 Light - Accent 6"/>
-    <w:basedOn w:val="887"/>
+    <w:basedOn w:val="903"/>
     <w:uiPriority w:val="99"/>
     <w:pPr>
       <w:pBdr/>
@@ -6152,9 +6330,9 @@
       </w:tcPr>
     </w:tblStylePr>
   </w:style>
-  <w:style w:type="table" w:styleId="715">
+  <w:style w:type="table" w:styleId="731">
     <w:name w:val="Grid Table 2"/>
-    <w:basedOn w:val="887"/>
+    <w:basedOn w:val="903"/>
     <w:uiPriority w:val="99"/>
     <w:pPr>
       <w:pBdr/>
@@ -6384,9 +6562,9 @@
       </w:tcPr>
     </w:tblStylePr>
   </w:style>
-  <w:style w:type="table" w:styleId="716">
+  <w:style w:type="table" w:styleId="732">
     <w:name w:val="Grid Table 2 - Accent 1"/>
-    <w:basedOn w:val="887"/>
+    <w:basedOn w:val="903"/>
     <w:uiPriority w:val="99"/>
     <w:pPr>
       <w:pBdr/>
@@ -6616,9 +6794,9 @@
       </w:tcPr>
     </w:tblStylePr>
   </w:style>
-  <w:style w:type="table" w:styleId="717">
+  <w:style w:type="table" w:styleId="733">
     <w:name w:val="Grid Table 2 - Accent 2"/>
-    <w:basedOn w:val="887"/>
+    <w:basedOn w:val="903"/>
     <w:uiPriority w:val="99"/>
     <w:pPr>
       <w:pBdr/>
@@ -6848,9 +7026,9 @@
       </w:tcPr>
     </w:tblStylePr>
   </w:style>
-  <w:style w:type="table" w:styleId="718">
+  <w:style w:type="table" w:styleId="734">
     <w:name w:val="Grid Table 2 - Accent 3"/>
-    <w:basedOn w:val="887"/>
+    <w:basedOn w:val="903"/>
     <w:uiPriority w:val="99"/>
     <w:pPr>
       <w:pBdr/>
@@ -7080,9 +7258,9 @@
       </w:tcPr>
     </w:tblStylePr>
   </w:style>
-  <w:style w:type="table" w:styleId="719">
+  <w:style w:type="table" w:styleId="735">
     <w:name w:val="Grid Table 2 - Accent 4"/>
-    <w:basedOn w:val="887"/>
+    <w:basedOn w:val="903"/>
     <w:uiPriority w:val="99"/>
     <w:pPr>
       <w:pBdr/>
@@ -7312,9 +7490,9 @@
       </w:tcPr>
     </w:tblStylePr>
   </w:style>
-  <w:style w:type="table" w:styleId="720">
+  <w:style w:type="table" w:styleId="736">
     <w:name w:val="Grid Table 2 - Accent 5"/>
-    <w:basedOn w:val="887"/>
+    <w:basedOn w:val="903"/>
     <w:uiPriority w:val="99"/>
     <w:pPr>
       <w:pBdr/>
@@ -7544,9 +7722,9 @@
       </w:tcPr>
     </w:tblStylePr>
   </w:style>
-  <w:style w:type="table" w:styleId="721">
+  <w:style w:type="table" w:styleId="737">
     <w:name w:val="Grid Table 2 - Accent 6"/>
-    <w:basedOn w:val="887"/>
+    <w:basedOn w:val="903"/>
     <w:uiPriority w:val="99"/>
     <w:pPr>
       <w:pBdr/>
@@ -7776,9 +7954,9 @@
       </w:tcPr>
     </w:tblStylePr>
   </w:style>
-  <w:style w:type="table" w:styleId="722">
+  <w:style w:type="table" w:styleId="738">
     <w:name w:val="Grid Table 3"/>
-    <w:basedOn w:val="887"/>
+    <w:basedOn w:val="903"/>
     <w:uiPriority w:val="99"/>
     <w:pPr>
       <w:pBdr/>
@@ -8021,9 +8199,9 @@
       </w:tcPr>
     </w:tblStylePr>
   </w:style>
-  <w:style w:type="table" w:styleId="723">
+  <w:style w:type="table" w:styleId="739">
     <w:name w:val="Grid Table 3 - Accent 1"/>
-    <w:basedOn w:val="887"/>
+    <w:basedOn w:val="903"/>
     <w:uiPriority w:val="99"/>
     <w:pPr>
       <w:pBdr/>
@@ -8266,9 +8444,9 @@
       </w:tcPr>
     </w:tblStylePr>
   </w:style>
-  <w:style w:type="table" w:styleId="724">
+  <w:style w:type="table" w:styleId="740">
     <w:name w:val="Grid Table 3 - Accent 2"/>
-    <w:basedOn w:val="887"/>
+    <w:basedOn w:val="903"/>
     <w:uiPriority w:val="99"/>
     <w:pPr>
       <w:pBdr/>
@@ -8511,9 +8689,9 @@
       </w:tcPr>
     </w:tblStylePr>
   </w:style>
-  <w:style w:type="table" w:styleId="725">
+  <w:style w:type="table" w:styleId="741">
     <w:name w:val="Grid Table 3 - Accent 3"/>
-    <w:basedOn w:val="887"/>
+    <w:basedOn w:val="903"/>
     <w:uiPriority w:val="99"/>
     <w:pPr>
       <w:pBdr/>
@@ -8756,9 +8934,9 @@
       </w:tcPr>
     </w:tblStylePr>
   </w:style>
-  <w:style w:type="table" w:styleId="726">
+  <w:style w:type="table" w:styleId="742">
     <w:name w:val="Grid Table 3 - Accent 4"/>
-    <w:basedOn w:val="887"/>
+    <w:basedOn w:val="903"/>
     <w:uiPriority w:val="99"/>
     <w:pPr>
       <w:pBdr/>
@@ -9001,9 +9179,9 @@
       </w:tcPr>
     </w:tblStylePr>
   </w:style>
-  <w:style w:type="table" w:styleId="727">
+  <w:style w:type="table" w:styleId="743">
     <w:name w:val="Grid Table 3 - Accent 5"/>
-    <w:basedOn w:val="887"/>
+    <w:basedOn w:val="903"/>
     <w:uiPriority w:val="99"/>
     <w:pPr>
       <w:pBdr/>
@@ -9246,9 +9424,9 @@
       </w:tcPr>
     </w:tblStylePr>
   </w:style>
-  <w:style w:type="table" w:styleId="728">
+  <w:style w:type="table" w:styleId="744">
     <w:name w:val="Grid Table 3 - Accent 6"/>
-    <w:basedOn w:val="887"/>
+    <w:basedOn w:val="903"/>
     <w:uiPriority w:val="99"/>
     <w:pPr>
       <w:pBdr/>
@@ -9491,9 +9669,9 @@
       </w:tcPr>
     </w:tblStylePr>
   </w:style>
-  <w:style w:type="table" w:styleId="729">
+  <w:style w:type="table" w:styleId="745">
     <w:name w:val="Grid Table 4"/>
-    <w:basedOn w:val="887"/>
+    <w:basedOn w:val="903"/>
     <w:uiPriority w:val="59"/>
     <w:pPr>
       <w:pBdr/>
@@ -9724,9 +9902,9 @@
       </w:tcPr>
     </w:tblStylePr>
   </w:style>
-  <w:style w:type="table" w:styleId="730">
+  <w:style w:type="table" w:styleId="746">
     <w:name w:val="Grid Table 4 - Accent 1"/>
-    <w:basedOn w:val="887"/>
+    <w:basedOn w:val="903"/>
     <w:uiPriority w:val="59"/>
     <w:pPr>
       <w:pBdr/>
@@ -9957,9 +10135,9 @@
       </w:tcPr>
     </w:tblStylePr>
   </w:style>
-  <w:style w:type="table" w:styleId="731">
+  <w:style w:type="table" w:styleId="747">
     <w:name w:val="Grid Table 4 - Accent 2"/>
-    <w:basedOn w:val="887"/>
+    <w:basedOn w:val="903"/>
     <w:uiPriority w:val="59"/>
     <w:pPr>
       <w:pBdr/>
@@ -10190,9 +10368,9 @@
       </w:tcPr>
     </w:tblStylePr>
   </w:style>
-  <w:style w:type="table" w:styleId="732">
+  <w:style w:type="table" w:styleId="748">
     <w:name w:val="Grid Table 4 - Accent 3"/>
-    <w:basedOn w:val="887"/>
+    <w:basedOn w:val="903"/>
     <w:uiPriority w:val="59"/>
     <w:pPr>
       <w:pBdr/>
@@ -10423,9 +10601,9 @@
       </w:tcPr>
     </w:tblStylePr>
   </w:style>
-  <w:style w:type="table" w:styleId="733">
+  <w:style w:type="table" w:styleId="749">
     <w:name w:val="Grid Table 4 - Accent 4"/>
-    <w:basedOn w:val="887"/>
+    <w:basedOn w:val="903"/>
     <w:uiPriority w:val="59"/>
     <w:pPr>
       <w:pBdr/>
@@ -10656,9 +10834,9 @@
       </w:tcPr>
     </w:tblStylePr>
   </w:style>
-  <w:style w:type="table" w:styleId="734">
+  <w:style w:type="table" w:styleId="750">
     <w:name w:val="Grid Table 4 - Accent 5"/>
-    <w:basedOn w:val="887"/>
+    <w:basedOn w:val="903"/>
     <w:uiPriority w:val="59"/>
     <w:pPr>
       <w:pBdr/>
@@ -10889,9 +11067,9 @@
       </w:tcPr>
     </w:tblStylePr>
   </w:style>
-  <w:style w:type="table" w:styleId="735">
+  <w:style w:type="table" w:styleId="751">
     <w:name w:val="Grid Table 4 - Accent 6"/>
-    <w:basedOn w:val="887"/>
+    <w:basedOn w:val="903"/>
     <w:uiPriority w:val="59"/>
     <w:pPr>
       <w:pBdr/>
@@ -11122,9 +11300,9 @@
       </w:tcPr>
     </w:tblStylePr>
   </w:style>
-  <w:style w:type="table" w:styleId="736">
+  <w:style w:type="table" w:styleId="752">
     <w:name w:val="Grid Table 5 Dark"/>
-    <w:basedOn w:val="887"/>
+    <w:basedOn w:val="903"/>
     <w:uiPriority w:val="99"/>
     <w:pPr>
       <w:pBdr/>
@@ -11350,9 +11528,9 @@
       </w:tcPr>
     </w:tblStylePr>
   </w:style>
-  <w:style w:type="table" w:styleId="737">
+  <w:style w:type="table" w:styleId="753">
     <w:name w:val="Grid Table 5 Dark- Accent 1"/>
-    <w:basedOn w:val="887"/>
+    <w:basedOn w:val="903"/>
     <w:uiPriority w:val="99"/>
     <w:pPr>
       <w:pBdr/>
@@ -11578,9 +11756,9 @@
       </w:tcPr>
     </w:tblStylePr>
   </w:style>
-  <w:style w:type="table" w:styleId="738">
+  <w:style w:type="table" w:styleId="754">
     <w:name w:val="Grid Table 5 Dark - Accent 2"/>
-    <w:basedOn w:val="887"/>
+    <w:basedOn w:val="903"/>
     <w:uiPriority w:val="99"/>
     <w:pPr>
       <w:pBdr/>
@@ -11806,9 +11984,9 @@
       </w:tcPr>
     </w:tblStylePr>
   </w:style>
-  <w:style w:type="table" w:styleId="739">
+  <w:style w:type="table" w:styleId="755">
     <w:name w:val="Grid Table 5 Dark - Accent 3"/>
-    <w:basedOn w:val="887"/>
+    <w:basedOn w:val="903"/>
     <w:uiPriority w:val="99"/>
     <w:pPr>
       <w:pBdr/>
@@ -12034,9 +12212,9 @@
       </w:tcPr>
     </w:tblStylePr>
   </w:style>
-  <w:style w:type="table" w:styleId="740">
+  <w:style w:type="table" w:styleId="756">
     <w:name w:val="Grid Table 5 Dark- Accent 4"/>
-    <w:basedOn w:val="887"/>
+    <w:basedOn w:val="903"/>
     <w:uiPriority w:val="99"/>
     <w:pPr>
       <w:pBdr/>
@@ -12262,9 +12440,9 @@
       </w:tcPr>
     </w:tblStylePr>
   </w:style>
-  <w:style w:type="table" w:styleId="741">
+  <w:style w:type="table" w:styleId="757">
     <w:name w:val="Grid Table 5 Dark - Accent 5"/>
-    <w:basedOn w:val="887"/>
+    <w:basedOn w:val="903"/>
     <w:uiPriority w:val="99"/>
     <w:pPr>
       <w:pBdr/>
@@ -12490,9 +12668,9 @@
       </w:tcPr>
     </w:tblStylePr>
   </w:style>
-  <w:style w:type="table" w:styleId="742">
+  <w:style w:type="table" w:styleId="758">
     <w:name w:val="Grid Table 5 Dark - Accent 6"/>
-    <w:basedOn w:val="887"/>
+    <w:basedOn w:val="903"/>
     <w:uiPriority w:val="99"/>
     <w:pPr>
       <w:pBdr/>
@@ -12718,9 +12896,9 @@
       </w:tcPr>
     </w:tblStylePr>
   </w:style>
-  <w:style w:type="table" w:styleId="743">
+  <w:style w:type="table" w:styleId="759">
     <w:name w:val="Grid Table 6 Colorful"/>
-    <w:basedOn w:val="887"/>
+    <w:basedOn w:val="903"/>
     <w:uiPriority w:val="99"/>
     <w:pPr>
       <w:pBdr/>
@@ -12948,9 +13126,9 @@
       </w:tcPr>
     </w:tblStylePr>
   </w:style>
-  <w:style w:type="table" w:styleId="744">
+  <w:style w:type="table" w:styleId="760">
     <w:name w:val="Grid Table 6 Colorful - Accent 1"/>
-    <w:basedOn w:val="887"/>
+    <w:basedOn w:val="903"/>
     <w:uiPriority w:val="99"/>
     <w:pPr>
       <w:pBdr/>
@@ -13178,9 +13356,9 @@
       </w:tcPr>
     </w:tblStylePr>
   </w:style>
-  <w:style w:type="table" w:styleId="745">
+  <w:style w:type="table" w:styleId="761">
     <w:name w:val="Grid Table 6 Colorful - Accent 2"/>
-    <w:basedOn w:val="887"/>
+    <w:basedOn w:val="903"/>
     <w:uiPriority w:val="99"/>
     <w:pPr>
       <w:pBdr/>
@@ -13408,9 +13586,9 @@
       </w:tcPr>
     </w:tblStylePr>
   </w:style>
-  <w:style w:type="table" w:styleId="746">
+  <w:style w:type="table" w:styleId="762">
     <w:name w:val="Grid Table 6 Colorful - Accent 3"/>
-    <w:basedOn w:val="887"/>
+    <w:basedOn w:val="903"/>
     <w:uiPriority w:val="99"/>
     <w:pPr>
       <w:pBdr/>
@@ -13638,9 +13816,9 @@
       </w:tcPr>
     </w:tblStylePr>
   </w:style>
-  <w:style w:type="table" w:styleId="747">
+  <w:style w:type="table" w:styleId="763">
     <w:name w:val="Grid Table 6 Colorful - Accent 4"/>
-    <w:basedOn w:val="887"/>
+    <w:basedOn w:val="903"/>
     <w:uiPriority w:val="99"/>
     <w:pPr>
       <w:pBdr/>
@@ -13868,9 +14046,9 @@
       </w:tcPr>
     </w:tblStylePr>
   </w:style>
-  <w:style w:type="table" w:styleId="748">
+  <w:style w:type="table" w:styleId="764">
     <w:name w:val="Grid Table 6 Colorful - Accent 5"/>
-    <w:basedOn w:val="887"/>
+    <w:basedOn w:val="903"/>
     <w:uiPriority w:val="99"/>
     <w:pPr>
       <w:pBdr/>
@@ -14098,9 +14276,9 @@
       </w:tcPr>
     </w:tblStylePr>
   </w:style>
-  <w:style w:type="table" w:styleId="749">
+  <w:style w:type="table" w:styleId="765">
     <w:name w:val="Grid Table 6 Colorful - Accent 6"/>
-    <w:basedOn w:val="887"/>
+    <w:basedOn w:val="903"/>
     <w:uiPriority w:val="99"/>
     <w:pPr>
       <w:pBdr/>
@@ -14328,9 +14506,9 @@
       </w:tcPr>
     </w:tblStylePr>
   </w:style>
-  <w:style w:type="table" w:styleId="750">
+  <w:style w:type="table" w:styleId="766">
     <w:name w:val="Grid Table 7 Colorful"/>
-    <w:basedOn w:val="887"/>
+    <w:basedOn w:val="903"/>
     <w:uiPriority w:val="99"/>
     <w:pPr>
       <w:pBdr/>
@@ -14582,9 +14760,9 @@
       </w:tcPr>
     </w:tblStylePr>
   </w:style>
-  <w:style w:type="table" w:styleId="751">
+  <w:style w:type="table" w:styleId="767">
     <w:name w:val="Grid Table 7 Colorful - Accent 1"/>
-    <w:basedOn w:val="887"/>
+    <w:basedOn w:val="903"/>
     <w:uiPriority w:val="99"/>
     <w:pPr>
       <w:pBdr/>
@@ -14836,9 +15014,9 @@
       </w:tcPr>
     </w:tblStylePr>
   </w:style>
-  <w:style w:type="table" w:styleId="752">
+  <w:style w:type="table" w:styleId="768">
     <w:name w:val="Grid Table 7 Colorful - Accent 2"/>
-    <w:basedOn w:val="887"/>
+    <w:basedOn w:val="903"/>
     <w:uiPriority w:val="99"/>
     <w:pPr>
       <w:pBdr/>
@@ -15090,9 +15268,9 @@
       </w:tcPr>
     </w:tblStylePr>
   </w:style>
-  <w:style w:type="table" w:styleId="753">
+  <w:style w:type="table" w:styleId="769">
     <w:name w:val="Grid Table 7 Colorful - Accent 3"/>
-    <w:basedOn w:val="887"/>
+    <w:basedOn w:val="903"/>
     <w:uiPriority w:val="99"/>
     <w:pPr>
       <w:pBdr/>
@@ -15344,9 +15522,9 @@
       </w:tcPr>
     </w:tblStylePr>
   </w:style>
-  <w:style w:type="table" w:styleId="754">
+  <w:style w:type="table" w:styleId="770">
     <w:name w:val="Grid Table 7 Colorful - Accent 4"/>
-    <w:basedOn w:val="887"/>
+    <w:basedOn w:val="903"/>
     <w:uiPriority w:val="99"/>
     <w:pPr>
       <w:pBdr/>
@@ -15598,9 +15776,9 @@
       </w:tcPr>
     </w:tblStylePr>
   </w:style>
-  <w:style w:type="table" w:styleId="755">
+  <w:style w:type="table" w:styleId="771">
     <w:name w:val="Grid Table 7 Colorful - Accent 5"/>
-    <w:basedOn w:val="887"/>
+    <w:basedOn w:val="903"/>
     <w:uiPriority w:val="99"/>
     <w:pPr>
       <w:pBdr/>
@@ -15852,9 +16030,9 @@
       </w:tcPr>
     </w:tblStylePr>
   </w:style>
-  <w:style w:type="table" w:styleId="756">
+  <w:style w:type="table" w:styleId="772">
     <w:name w:val="Grid Table 7 Colorful - Accent 6"/>
-    <w:basedOn w:val="887"/>
+    <w:basedOn w:val="903"/>
     <w:uiPriority w:val="99"/>
     <w:pPr>
       <w:pBdr/>
@@ -16106,9 +16284,9 @@
       </w:tcPr>
     </w:tblStylePr>
   </w:style>
-  <w:style w:type="table" w:styleId="757">
+  <w:style w:type="table" w:styleId="773">
     <w:name w:val="List Table 1 Light"/>
-    <w:basedOn w:val="887"/>
+    <w:basedOn w:val="903"/>
     <w:uiPriority w:val="99"/>
     <w:pPr>
       <w:pBdr/>
@@ -16322,9 +16500,9 @@
       </w:tcPr>
     </w:tblStylePr>
   </w:style>
-  <w:style w:type="table" w:styleId="758">
+  <w:style w:type="table" w:styleId="774">
     <w:name w:val="List Table 1 Light - Accent 1"/>
-    <w:basedOn w:val="887"/>
+    <w:basedOn w:val="903"/>
     <w:uiPriority w:val="99"/>
     <w:pPr>
       <w:pBdr/>
@@ -16538,9 +16716,9 @@
       </w:tcPr>
     </w:tblStylePr>
   </w:style>
-  <w:style w:type="table" w:styleId="759">
+  <w:style w:type="table" w:styleId="775">
     <w:name w:val="List Table 1 Light - Accent 2"/>
-    <w:basedOn w:val="887"/>
+    <w:basedOn w:val="903"/>
     <w:uiPriority w:val="99"/>
     <w:pPr>
       <w:pBdr/>
@@ -16754,9 +16932,9 @@
       </w:tcPr>
     </w:tblStylePr>
   </w:style>
-  <w:style w:type="table" w:styleId="760">
+  <w:style w:type="table" w:styleId="776">
     <w:name w:val="List Table 1 Light - Accent 3"/>
-    <w:basedOn w:val="887"/>
+    <w:basedOn w:val="903"/>
     <w:uiPriority w:val="99"/>
     <w:pPr>
       <w:pBdr/>
@@ -16970,9 +17148,9 @@
       </w:tcPr>
     </w:tblStylePr>
   </w:style>
-  <w:style w:type="table" w:styleId="761">
+  <w:style w:type="table" w:styleId="777">
     <w:name w:val="List Table 1 Light - Accent 4"/>
-    <w:basedOn w:val="887"/>
+    <w:basedOn w:val="903"/>
     <w:uiPriority w:val="99"/>
     <w:pPr>
       <w:pBdr/>
@@ -17186,9 +17364,9 @@
       </w:tcPr>
     </w:tblStylePr>
   </w:style>
-  <w:style w:type="table" w:styleId="762">
+  <w:style w:type="table" w:styleId="778">
     <w:name w:val="List Table 1 Light - Accent 5"/>
-    <w:basedOn w:val="887"/>
+    <w:basedOn w:val="903"/>
     <w:uiPriority w:val="99"/>
     <w:pPr>
       <w:pBdr/>
@@ -17402,9 +17580,9 @@
       </w:tcPr>
     </w:tblStylePr>
   </w:style>
-  <w:style w:type="table" w:styleId="763">
+  <w:style w:type="table" w:styleId="779">
     <w:name w:val="List Table 1 Light - Accent 6"/>
-    <w:basedOn w:val="887"/>
+    <w:basedOn w:val="903"/>
     <w:uiPriority w:val="99"/>
     <w:pPr>
       <w:pBdr/>
@@ -17618,9 +17796,9 @@
       </w:tcPr>
     </w:tblStylePr>
   </w:style>
-  <w:style w:type="table" w:styleId="764">
+  <w:style w:type="table" w:styleId="780">
     <w:name w:val="List Table 2"/>
-    <w:basedOn w:val="887"/>
+    <w:basedOn w:val="903"/>
     <w:uiPriority w:val="99"/>
     <w:pPr>
       <w:pBdr/>
@@ -17856,9 +18034,9 @@
       </w:tcPr>
     </w:tblStylePr>
   </w:style>
-  <w:style w:type="table" w:styleId="765">
+  <w:style w:type="table" w:styleId="781">
     <w:name w:val="List Table 2 - Accent 1"/>
-    <w:basedOn w:val="887"/>
+    <w:basedOn w:val="903"/>
     <w:uiPriority w:val="99"/>
     <w:pPr>
       <w:pBdr/>
@@ -18094,9 +18272,9 @@
       </w:tcPr>
     </w:tblStylePr>
   </w:style>
-  <w:style w:type="table" w:styleId="766">
+  <w:style w:type="table" w:styleId="782">
     <w:name w:val="List Table 2 - Accent 2"/>
-    <w:basedOn w:val="887"/>
+    <w:basedOn w:val="903"/>
     <w:uiPriority w:val="99"/>
     <w:pPr>
       <w:pBdr/>
@@ -18332,9 +18510,9 @@
       </w:tcPr>
     </w:tblStylePr>
   </w:style>
-  <w:style w:type="table" w:styleId="767">
+  <w:style w:type="table" w:styleId="783">
     <w:name w:val="List Table 2 - Accent 3"/>
-    <w:basedOn w:val="887"/>
+    <w:basedOn w:val="903"/>
     <w:uiPriority w:val="99"/>
     <w:pPr>
       <w:pBdr/>
@@ -18570,9 +18748,9 @@
       </w:tcPr>
     </w:tblStylePr>
   </w:style>
-  <w:style w:type="table" w:styleId="768">
+  <w:style w:type="table" w:styleId="784">
     <w:name w:val="List Table 2 - Accent 4"/>
-    <w:basedOn w:val="887"/>
+    <w:basedOn w:val="903"/>
     <w:uiPriority w:val="99"/>
     <w:pPr>
       <w:pBdr/>
@@ -18808,9 +18986,9 @@
       </w:tcPr>
     </w:tblStylePr>
   </w:style>
-  <w:style w:type="table" w:styleId="769">
+  <w:style w:type="table" w:styleId="785">
     <w:name w:val="List Table 2 - Accent 5"/>
-    <w:basedOn w:val="887"/>
+    <w:basedOn w:val="903"/>
     <w:uiPriority w:val="99"/>
     <w:pPr>
       <w:pBdr/>
@@ -19046,9 +19224,9 @@
       </w:tcPr>
     </w:tblStylePr>
   </w:style>
-  <w:style w:type="table" w:styleId="770">
+  <w:style w:type="table" w:styleId="786">
     <w:name w:val="List Table 2 - Accent 6"/>
-    <w:basedOn w:val="887"/>
+    <w:basedOn w:val="903"/>
     <w:uiPriority w:val="99"/>
     <w:pPr>
       <w:pBdr/>
@@ -19284,9 +19462,9 @@
       </w:tcPr>
     </w:tblStylePr>
   </w:style>
-  <w:style w:type="table" w:styleId="771">
+  <w:style w:type="table" w:styleId="787">
     <w:name w:val="List Table 3"/>
-    <w:basedOn w:val="887"/>
+    <w:basedOn w:val="903"/>
     <w:uiPriority w:val="99"/>
     <w:pPr>
       <w:pBdr/>
@@ -19512,9 +19690,9 @@
       </w:tcPr>
     </w:tblStylePr>
   </w:style>
-  <w:style w:type="table" w:styleId="772">
+  <w:style w:type="table" w:styleId="788">
     <w:name w:val="List Table 3 - Accent 1"/>
-    <w:basedOn w:val="887"/>
+    <w:basedOn w:val="903"/>
     <w:uiPriority w:val="99"/>
     <w:pPr>
       <w:pBdr/>
@@ -19740,9 +19918,9 @@
       </w:tcPr>
     </w:tblStylePr>
   </w:style>
-  <w:style w:type="table" w:styleId="773">
+  <w:style w:type="table" w:styleId="789">
     <w:name w:val="List Table 3 - Accent 2"/>
-    <w:basedOn w:val="887"/>
+    <w:basedOn w:val="903"/>
     <w:uiPriority w:val="99"/>
     <w:pPr>
       <w:pBdr/>
@@ -19968,9 +20146,9 @@
       </w:tcPr>
     </w:tblStylePr>
   </w:style>
-  <w:style w:type="table" w:styleId="774">
+  <w:style w:type="table" w:styleId="790">
     <w:name w:val="List Table 3 - Accent 3"/>
-    <w:basedOn w:val="887"/>
+    <w:basedOn w:val="903"/>
     <w:uiPriority w:val="99"/>
     <w:pPr>
       <w:pBdr/>
@@ -20196,9 +20374,9 @@
       </w:tcPr>
     </w:tblStylePr>
   </w:style>
-  <w:style w:type="table" w:styleId="775">
+  <w:style w:type="table" w:styleId="791">
     <w:name w:val="List Table 3 - Accent 4"/>
-    <w:basedOn w:val="887"/>
+    <w:basedOn w:val="903"/>
     <w:uiPriority w:val="99"/>
     <w:pPr>
       <w:pBdr/>
@@ -20424,9 +20602,9 @@
       </w:tcPr>
     </w:tblStylePr>
   </w:style>
-  <w:style w:type="table" w:styleId="776">
+  <w:style w:type="table" w:styleId="792">
     <w:name w:val="List Table 3 - Accent 5"/>
-    <w:basedOn w:val="887"/>
+    <w:basedOn w:val="903"/>
     <w:uiPriority w:val="99"/>
     <w:pPr>
       <w:pBdr/>
@@ -20652,9 +20830,9 @@
       </w:tcPr>
     </w:tblStylePr>
   </w:style>
-  <w:style w:type="table" w:styleId="777">
+  <w:style w:type="table" w:styleId="793">
     <w:name w:val="List Table 3 - Accent 6"/>
-    <w:basedOn w:val="887"/>
+    <w:basedOn w:val="903"/>
     <w:uiPriority w:val="99"/>
     <w:pPr>
       <w:pBdr/>
@@ -20880,9 +21058,9 @@
       </w:tcPr>
     </w:tblStylePr>
   </w:style>
-  <w:style w:type="table" w:styleId="778">
+  <w:style w:type="table" w:styleId="794">
     <w:name w:val="List Table 4"/>
-    <w:basedOn w:val="887"/>
+    <w:basedOn w:val="903"/>
     <w:uiPriority w:val="99"/>
     <w:pPr>
       <w:pBdr/>
@@ -21105,9 +21283,9 @@
       </w:tcPr>
     </w:tblStylePr>
   </w:style>
-  <w:style w:type="table" w:styleId="779">
+  <w:style w:type="table" w:styleId="795">
     <w:name w:val="List Table 4 - Accent 1"/>
-    <w:basedOn w:val="887"/>
+    <w:basedOn w:val="903"/>
     <w:uiPriority w:val="99"/>
     <w:pPr>
       <w:pBdr/>
@@ -21330,9 +21508,9 @@
       </w:tcPr>
     </w:tblStylePr>
   </w:style>
-  <w:style w:type="table" w:styleId="780">
+  <w:style w:type="table" w:styleId="796">
     <w:name w:val="List Table 4 - Accent 2"/>
-    <w:basedOn w:val="887"/>
+    <w:basedOn w:val="903"/>
     <w:uiPriority w:val="99"/>
     <w:pPr>
       <w:pBdr/>
@@ -21555,9 +21733,9 @@
       </w:tcPr>
     </w:tblStylePr>
   </w:style>
-  <w:style w:type="table" w:styleId="781">
+  <w:style w:type="table" w:styleId="797">
     <w:name w:val="List Table 4 - Accent 3"/>
-    <w:basedOn w:val="887"/>
+    <w:basedOn w:val="903"/>
     <w:uiPriority w:val="99"/>
     <w:pPr>
       <w:pBdr/>
@@ -21780,9 +21958,9 @@
       </w:tcPr>
     </w:tblStylePr>
   </w:style>
-  <w:style w:type="table" w:styleId="782">
+  <w:style w:type="table" w:styleId="798">
     <w:name w:val="List Table 4 - Accent 4"/>
-    <w:basedOn w:val="887"/>
+    <w:basedOn w:val="903"/>
     <w:uiPriority w:val="99"/>
     <w:pPr>
       <w:pBdr/>
@@ -22005,9 +22183,9 @@
       </w:tcPr>
     </w:tblStylePr>
   </w:style>
-  <w:style w:type="table" w:styleId="783">
+  <w:style w:type="table" w:styleId="799">
     <w:name w:val="List Table 4 - Accent 5"/>
-    <w:basedOn w:val="887"/>
+    <w:basedOn w:val="903"/>
     <w:uiPriority w:val="99"/>
     <w:pPr>
       <w:pBdr/>
@@ -22230,9 +22408,9 @@
       </w:tcPr>
     </w:tblStylePr>
   </w:style>
-  <w:style w:type="table" w:styleId="784">
+  <w:style w:type="table" w:styleId="800">
     <w:name w:val="List Table 4 - Accent 6"/>
-    <w:basedOn w:val="887"/>
+    <w:basedOn w:val="903"/>
     <w:uiPriority w:val="99"/>
     <w:pPr>
       <w:pBdr/>
@@ -22455,9 +22633,9 @@
       </w:tcPr>
     </w:tblStylePr>
   </w:style>
-  <w:style w:type="table" w:styleId="785">
+  <w:style w:type="table" w:styleId="801">
     <w:name w:val="List Table 5 Dark"/>
-    <w:basedOn w:val="887"/>
+    <w:basedOn w:val="903"/>
     <w:uiPriority w:val="99"/>
     <w:pPr>
       <w:pBdr/>
@@ -22697,9 +22875,9 @@
       </w:tcPr>
     </w:tblStylePr>
   </w:style>
-  <w:style w:type="table" w:styleId="786">
+  <w:style w:type="table" w:styleId="802">
     <w:name w:val="List Table 5 Dark - Accent 1"/>
-    <w:basedOn w:val="887"/>
+    <w:basedOn w:val="903"/>
     <w:uiPriority w:val="99"/>
     <w:pPr>
       <w:pBdr/>
@@ -22939,9 +23117,9 @@
       </w:tcPr>
     </w:tblStylePr>
   </w:style>
-  <w:style w:type="table" w:styleId="787">
+  <w:style w:type="table" w:styleId="803">
     <w:name w:val="List Table 5 Dark - Accent 2"/>
-    <w:basedOn w:val="887"/>
+    <w:basedOn w:val="903"/>
     <w:uiPriority w:val="99"/>
     <w:pPr>
       <w:pBdr/>
@@ -23181,9 +23359,9 @@
       </w:tcPr>
     </w:tblStylePr>
   </w:style>
-  <w:style w:type="table" w:styleId="788">
+  <w:style w:type="table" w:styleId="804">
     <w:name w:val="List Table 5 Dark - Accent 3"/>
-    <w:basedOn w:val="887"/>
+    <w:basedOn w:val="903"/>
     <w:uiPriority w:val="99"/>
     <w:pPr>
       <w:pBdr/>
@@ -23423,9 +23601,9 @@
       </w:tcPr>
     </w:tblStylePr>
   </w:style>
-  <w:style w:type="table" w:styleId="789">
+  <w:style w:type="table" w:styleId="805">
     <w:name w:val="List Table 5 Dark - Accent 4"/>
-    <w:basedOn w:val="887"/>
+    <w:basedOn w:val="903"/>
     <w:uiPriority w:val="99"/>
     <w:pPr>
       <w:pBdr/>
@@ -23665,9 +23843,9 @@
       </w:tcPr>
     </w:tblStylePr>
   </w:style>
-  <w:style w:type="table" w:styleId="790">
+  <w:style w:type="table" w:styleId="806">
     <w:name w:val="List Table 5 Dark - Accent 5"/>
-    <w:basedOn w:val="887"/>
+    <w:basedOn w:val="903"/>
     <w:uiPriority w:val="99"/>
     <w:pPr>
       <w:pBdr/>
@@ -23907,9 +24085,9 @@
       </w:tcPr>
     </w:tblStylePr>
   </w:style>
-  <w:style w:type="table" w:styleId="791">
+  <w:style w:type="table" w:styleId="807">
     <w:name w:val="List Table 5 Dark - Accent 6"/>
-    <w:basedOn w:val="887"/>
+    <w:basedOn w:val="903"/>
     <w:uiPriority w:val="99"/>
     <w:pPr>
       <w:pBdr/>
@@ -24149,9 +24327,9 @@
       </w:tcPr>
     </w:tblStylePr>
   </w:style>
-  <w:style w:type="table" w:styleId="792">
+  <w:style w:type="table" w:styleId="808">
     <w:name w:val="List Table 6 Colorful"/>
-    <w:basedOn w:val="887"/>
+    <w:basedOn w:val="903"/>
     <w:uiPriority w:val="99"/>
     <w:pPr>
       <w:pBdr/>
@@ -24372,9 +24550,9 @@
       </w:tcPr>
     </w:tblStylePr>
   </w:style>
-  <w:style w:type="table" w:styleId="793">
+  <w:style w:type="table" w:styleId="809">
     <w:name w:val="List Table 6 Colorful - Accent 1"/>
-    <w:basedOn w:val="887"/>
+    <w:basedOn w:val="903"/>
     <w:uiPriority w:val="99"/>
     <w:pPr>
       <w:pBdr/>
@@ -24595,9 +24773,9 @@
       </w:tcPr>
     </w:tblStylePr>
   </w:style>
-  <w:style w:type="table" w:styleId="794">
+  <w:style w:type="table" w:styleId="810">
     <w:name w:val="List Table 6 Colorful - Accent 2"/>
-    <w:basedOn w:val="887"/>
+    <w:basedOn w:val="903"/>
     <w:uiPriority w:val="99"/>
     <w:pPr>
       <w:pBdr/>
@@ -24818,9 +24996,9 @@
       </w:tcPr>
     </w:tblStylePr>
   </w:style>
-  <w:style w:type="table" w:styleId="795">
+  <w:style w:type="table" w:styleId="811">
     <w:name w:val="List Table 6 Colorful - Accent 3"/>
-    <w:basedOn w:val="887"/>
+    <w:basedOn w:val="903"/>
     <w:uiPriority w:val="99"/>
     <w:pPr>
       <w:pBdr/>
@@ -25041,9 +25219,9 @@
       </w:tcPr>
     </w:tblStylePr>
   </w:style>
-  <w:style w:type="table" w:styleId="796">
+  <w:style w:type="table" w:styleId="812">
     <w:name w:val="List Table 6 Colorful - Accent 4"/>
-    <w:basedOn w:val="887"/>
+    <w:basedOn w:val="903"/>
     <w:uiPriority w:val="99"/>
     <w:pPr>
       <w:pBdr/>
@@ -25264,9 +25442,9 @@
       </w:tcPr>
     </w:tblStylePr>
   </w:style>
-  <w:style w:type="table" w:styleId="797">
+  <w:style w:type="table" w:styleId="813">
     <w:name w:val="List Table 6 Colorful - Accent 5"/>
-    <w:basedOn w:val="887"/>
+    <w:basedOn w:val="903"/>
     <w:uiPriority w:val="99"/>
     <w:pPr>
       <w:pBdr/>
@@ -25487,9 +25665,9 @@
       </w:tcPr>
     </w:tblStylePr>
   </w:style>
-  <w:style w:type="table" w:styleId="798">
+  <w:style w:type="table" w:styleId="814">
     <w:name w:val="List Table 6 Colorful - Accent 6"/>
-    <w:basedOn w:val="887"/>
+    <w:basedOn w:val="903"/>
     <w:uiPriority w:val="99"/>
     <w:pPr>
       <w:pBdr/>
@@ -25710,9 +25888,9 @@
       </w:tcPr>
     </w:tblStylePr>
   </w:style>
-  <w:style w:type="table" w:styleId="799">
+  <w:style w:type="table" w:styleId="815">
     <w:name w:val="List Table 7 Colorful"/>
-    <w:basedOn w:val="887"/>
+    <w:basedOn w:val="903"/>
     <w:uiPriority w:val="99"/>
     <w:pPr>
       <w:pBdr/>
@@ -25966,9 +26144,9 @@
       </w:tcPr>
     </w:tblStylePr>
   </w:style>
-  <w:style w:type="table" w:styleId="800">
+  <w:style w:type="table" w:styleId="816">
     <w:name w:val="List Table 7 Colorful - Accent 1"/>
-    <w:basedOn w:val="887"/>
+    <w:basedOn w:val="903"/>
     <w:uiPriority w:val="99"/>
     <w:pPr>
       <w:pBdr/>
@@ -26222,9 +26400,9 @@
       </w:tcPr>
     </w:tblStylePr>
   </w:style>
-  <w:style w:type="table" w:styleId="801">
+  <w:style w:type="table" w:styleId="817">
     <w:name w:val="List Table 7 Colorful - Accent 2"/>
-    <w:basedOn w:val="887"/>
+    <w:basedOn w:val="903"/>
     <w:uiPriority w:val="99"/>
     <w:pPr>
       <w:pBdr/>
@@ -26478,9 +26656,9 @@
       </w:tcPr>
     </w:tblStylePr>
   </w:style>
-  <w:style w:type="table" w:styleId="802">
+  <w:style w:type="table" w:styleId="818">
     <w:name w:val="List Table 7 Colorful - Accent 3"/>
-    <w:basedOn w:val="887"/>
+    <w:basedOn w:val="903"/>
     <w:uiPriority w:val="99"/>
     <w:pPr>
       <w:pBdr/>
@@ -26734,9 +26912,9 @@
       </w:tcPr>
     </w:tblStylePr>
   </w:style>
-  <w:style w:type="table" w:styleId="803">
+  <w:style w:type="table" w:styleId="819">
     <w:name w:val="List Table 7 Colorful - Accent 4"/>
-    <w:basedOn w:val="887"/>
+    <w:basedOn w:val="903"/>
     <w:uiPriority w:val="99"/>
     <w:pPr>
       <w:pBdr/>
@@ -26990,9 +27168,9 @@
       </w:tcPr>
     </w:tblStylePr>
   </w:style>
-  <w:style w:type="table" w:styleId="804">
+  <w:style w:type="table" w:styleId="820">
     <w:name w:val="List Table 7 Colorful - Accent 5"/>
-    <w:basedOn w:val="887"/>
+    <w:basedOn w:val="903"/>
     <w:uiPriority w:val="99"/>
     <w:pPr>
       <w:pBdr/>
@@ -27246,9 +27424,9 @@
       </w:tcPr>
     </w:tblStylePr>
   </w:style>
-  <w:style w:type="table" w:styleId="805">
+  <w:style w:type="table" w:styleId="821">
     <w:name w:val="List Table 7 Colorful - Accent 6"/>
-    <w:basedOn w:val="887"/>
+    <w:basedOn w:val="903"/>
     <w:uiPriority w:val="99"/>
     <w:pPr>
       <w:pBdr/>
@@ -27502,9 +27680,9 @@
       </w:tcPr>
     </w:tblStylePr>
   </w:style>
-  <w:style w:type="table" w:styleId="806">
+  <w:style w:type="table" w:styleId="822">
     <w:name w:val="Lined - Accent"/>
-    <w:basedOn w:val="887"/>
+    <w:basedOn w:val="903"/>
     <w:uiPriority w:val="99"/>
     <w:pPr>
       <w:pBdr/>
@@ -27739,9 +27917,9 @@
       </w:tcPr>
     </w:tblStylePr>
   </w:style>
-  <w:style w:type="table" w:styleId="807">
+  <w:style w:type="table" w:styleId="823">
     <w:name w:val="Lined - Accent 1"/>
-    <w:basedOn w:val="887"/>
+    <w:basedOn w:val="903"/>
     <w:uiPriority w:val="99"/>
     <w:pPr>
       <w:pBdr/>
@@ -27976,9 +28154,9 @@
       </w:tcPr>
     </w:tblStylePr>
   </w:style>
-  <w:style w:type="table" w:styleId="808">
+  <w:style w:type="table" w:styleId="824">
     <w:name w:val="Lined - Accent 2"/>
-    <w:basedOn w:val="887"/>
+    <w:basedOn w:val="903"/>
     <w:uiPriority w:val="99"/>
     <w:pPr>
       <w:pBdr/>
@@ -28213,9 +28391,9 @@
       </w:tcPr>
     </w:tblStylePr>
   </w:style>
-  <w:style w:type="table" w:styleId="809">
+  <w:style w:type="table" w:styleId="825">
     <w:name w:val="Lined - Accent 3"/>
-    <w:basedOn w:val="887"/>
+    <w:basedOn w:val="903"/>
     <w:uiPriority w:val="99"/>
     <w:pPr>
       <w:pBdr/>
@@ -28450,9 +28628,9 @@
       </w:tcPr>
     </w:tblStylePr>
   </w:style>
-  <w:style w:type="table" w:styleId="810">
+  <w:style w:type="table" w:styleId="826">
     <w:name w:val="Lined - Accent 4"/>
-    <w:basedOn w:val="887"/>
+    <w:basedOn w:val="903"/>
     <w:uiPriority w:val="99"/>
     <w:pPr>
       <w:pBdr/>
@@ -28687,9 +28865,9 @@
       </w:tcPr>
     </w:tblStylePr>
   </w:style>
-  <w:style w:type="table" w:styleId="811">
+  <w:style w:type="table" w:styleId="827">
     <w:name w:val="Lined - Accent 5"/>
-    <w:basedOn w:val="887"/>
+    <w:basedOn w:val="903"/>
     <w:uiPriority w:val="99"/>
     <w:pPr>
       <w:pBdr/>
@@ -28924,9 +29102,9 @@
       </w:tcPr>
     </w:tblStylePr>
   </w:style>
-  <w:style w:type="table" w:styleId="812">
+  <w:style w:type="table" w:styleId="828">
     <w:name w:val="Lined - Accent 6"/>
-    <w:basedOn w:val="887"/>
+    <w:basedOn w:val="903"/>
     <w:uiPriority w:val="99"/>
     <w:pPr>
       <w:pBdr/>
@@ -29161,9 +29339,9 @@
       </w:tcPr>
     </w:tblStylePr>
   </w:style>
-  <w:style w:type="table" w:styleId="813">
+  <w:style w:type="table" w:styleId="829">
     <w:name w:val="Bordered &amp; Lined - Accent"/>
-    <w:basedOn w:val="887"/>
+    <w:basedOn w:val="903"/>
     <w:uiPriority w:val="99"/>
     <w:pPr>
       <w:pBdr/>
@@ -29405,9 +29583,9 @@
       </w:tcPr>
     </w:tblStylePr>
   </w:style>
-  <w:style w:type="table" w:styleId="814">
+  <w:style w:type="table" w:styleId="830">
     <w:name w:val="Bordered &amp; Lined - Accent 1"/>
-    <w:basedOn w:val="887"/>
+    <w:basedOn w:val="903"/>
     <w:uiPriority w:val="99"/>
     <w:pPr>
       <w:pBdr/>
@@ -29649,9 +29827,9 @@
       </w:tcPr>
     </w:tblStylePr>
   </w:style>
-  <w:style w:type="table" w:styleId="815">
+  <w:style w:type="table" w:styleId="831">
     <w:name w:val="Bordered &amp; Lined - Accent 2"/>
-    <w:basedOn w:val="887"/>
+    <w:basedOn w:val="903"/>
     <w:uiPriority w:val="99"/>
     <w:pPr>
       <w:pBdr/>
@@ -29893,9 +30071,9 @@
       </w:tcPr>
     </w:tblStylePr>
   </w:style>
-  <w:style w:type="table" w:styleId="816">
+  <w:style w:type="table" w:styleId="832">
     <w:name w:val="Bordered &amp; Lined - Accent 3"/>
-    <w:basedOn w:val="887"/>
+    <w:basedOn w:val="903"/>
     <w:uiPriority w:val="99"/>
     <w:pPr>
       <w:pBdr/>
@@ -30137,9 +30315,9 @@
       </w:tcPr>
     </w:tblStylePr>
   </w:style>
-  <w:style w:type="table" w:styleId="817">
+  <w:style w:type="table" w:styleId="833">
     <w:name w:val="Bordered &amp; Lined - Accent 4"/>
-    <w:basedOn w:val="887"/>
+    <w:basedOn w:val="903"/>
     <w:uiPriority w:val="99"/>
     <w:pPr>
       <w:pBdr/>
@@ -30381,9 +30559,9 @@
       </w:tcPr>
     </w:tblStylePr>
   </w:style>
-  <w:style w:type="table" w:styleId="818">
+  <w:style w:type="table" w:styleId="834">
     <w:name w:val="Bordered &amp; Lined - Accent 5"/>
-    <w:basedOn w:val="887"/>
+    <w:basedOn w:val="903"/>
     <w:uiPriority w:val="99"/>
     <w:pPr>
       <w:pBdr/>
@@ -30625,9 +30803,9 @@
       </w:tcPr>
     </w:tblStylePr>
   </w:style>
-  <w:style w:type="table" w:styleId="819">
+  <w:style w:type="table" w:styleId="835">
     <w:name w:val="Bordered &amp; Lined - Accent 6"/>
-    <w:basedOn w:val="887"/>
+    <w:basedOn w:val="903"/>
     <w:uiPriority w:val="99"/>
     <w:pPr>
       <w:pBdr/>
@@ -30869,9 +31047,9 @@
       </w:tcPr>
     </w:tblStylePr>
   </w:style>
-  <w:style w:type="table" w:styleId="820">
+  <w:style w:type="table" w:styleId="836">
     <w:name w:val="Bordered"/>
-    <w:basedOn w:val="887"/>
+    <w:basedOn w:val="903"/>
     <w:uiPriority w:val="99"/>
     <w:pPr>
       <w:pBdr/>
@@ -31100,9 +31278,9 @@
       </w:tcPr>
     </w:tblStylePr>
   </w:style>
-  <w:style w:type="table" w:styleId="821">
+  <w:style w:type="table" w:styleId="837">
     <w:name w:val="Bordered - Accent 1"/>
-    <w:basedOn w:val="887"/>
+    <w:basedOn w:val="903"/>
     <w:uiPriority w:val="99"/>
     <w:pPr>
       <w:pBdr/>
@@ -31331,9 +31509,9 @@
       </w:tcPr>
     </w:tblStylePr>
   </w:style>
-  <w:style w:type="table" w:styleId="822">
+  <w:style w:type="table" w:styleId="838">
     <w:name w:val="Bordered - Accent 2"/>
-    <w:basedOn w:val="887"/>
+    <w:basedOn w:val="903"/>
     <w:uiPriority w:val="99"/>
     <w:pPr>
       <w:pBdr/>
@@ -31562,9 +31740,9 @@
       </w:tcPr>
     </w:tblStylePr>
   </w:style>
-  <w:style w:type="table" w:styleId="823">
+  <w:style w:type="table" w:styleId="839">
     <w:name w:val="Bordered - Accent 3"/>
-    <w:basedOn w:val="887"/>
+    <w:basedOn w:val="903"/>
     <w:uiPriority w:val="99"/>
     <w:pPr>
       <w:pBdr/>
@@ -31793,9 +31971,9 @@
       </w:tcPr>
     </w:tblStylePr>
   </w:style>
-  <w:style w:type="table" w:styleId="824">
+  <w:style w:type="table" w:styleId="840">
     <w:name w:val="Bordered - Accent 4"/>
-    <w:basedOn w:val="887"/>
+    <w:basedOn w:val="903"/>
     <w:uiPriority w:val="99"/>
     <w:pPr>
       <w:pBdr/>
@@ -32024,9 +32202,9 @@
       </w:tcPr>
     </w:tblStylePr>
   </w:style>
-  <w:style w:type="table" w:styleId="825">
+  <w:style w:type="table" w:styleId="841">
     <w:name w:val="Bordered - Accent 5"/>
-    <w:basedOn w:val="887"/>
+    <w:basedOn w:val="903"/>
     <w:uiPriority w:val="99"/>
     <w:pPr>
       <w:pBdr/>
@@ -32255,9 +32433,9 @@
       </w:tcPr>
     </w:tblStylePr>
   </w:style>
-  <w:style w:type="table" w:styleId="826">
+  <w:style w:type="table" w:styleId="842">
     <w:name w:val="Bordered - Accent 6"/>
-    <w:basedOn w:val="887"/>
+    <w:basedOn w:val="903"/>
     <w:uiPriority w:val="99"/>
     <w:pPr>
       <w:pBdr/>
@@ -32486,11 +32664,11 @@
       </w:tcPr>
     </w:tblStylePr>
   </w:style>
-  <w:style w:type="paragraph" w:styleId="827">
+  <w:style w:type="paragraph" w:styleId="843">
     <w:name w:val="Heading 1"/>
-    <w:basedOn w:val="886"/>
-    <w:next w:val="886"/>
-    <w:link w:val="837"/>
+    <w:basedOn w:val="902"/>
+    <w:next w:val="902"/>
+    <w:link w:val="853"/>
     <w:uiPriority w:val="9"/>
     <w:qFormat/>
     <w:pPr>
@@ -32508,11 +32686,11 @@
       <w:szCs w:val="40"/>
     </w:rPr>
   </w:style>
-  <w:style w:type="paragraph" w:styleId="828">
+  <w:style w:type="paragraph" w:styleId="844">
     <w:name w:val="Heading 2"/>
-    <w:basedOn w:val="886"/>
-    <w:next w:val="886"/>
-    <w:link w:val="838"/>
+    <w:basedOn w:val="902"/>
+    <w:next w:val="902"/>
+    <w:link w:val="854"/>
     <w:uiPriority w:val="9"/>
     <w:unhideWhenUsed/>
     <w:qFormat/>
@@ -32531,11 +32709,11 @@
       <w:szCs w:val="32"/>
     </w:rPr>
   </w:style>
-  <w:style w:type="paragraph" w:styleId="829">
+  <w:style w:type="paragraph" w:styleId="845">
     <w:name w:val="Heading 3"/>
-    <w:basedOn w:val="886"/>
-    <w:next w:val="886"/>
-    <w:link w:val="839"/>
+    <w:basedOn w:val="902"/>
+    <w:next w:val="902"/>
+    <w:link w:val="855"/>
     <w:uiPriority w:val="9"/>
     <w:unhideWhenUsed/>
     <w:qFormat/>
@@ -32554,11 +32732,11 @@
       <w:szCs w:val="28"/>
     </w:rPr>
   </w:style>
-  <w:style w:type="paragraph" w:styleId="830">
+  <w:style w:type="paragraph" w:styleId="846">
     <w:name w:val="Heading 4"/>
-    <w:basedOn w:val="886"/>
-    <w:next w:val="886"/>
-    <w:link w:val="840"/>
+    <w:basedOn w:val="902"/>
+    <w:next w:val="902"/>
+    <w:link w:val="856"/>
     <w:uiPriority w:val="9"/>
     <w:unhideWhenUsed/>
     <w:qFormat/>
@@ -32577,11 +32755,11 @@
       <w:color w:val="0f4761" w:themeColor="accent1" w:themeShade="BF"/>
     </w:rPr>
   </w:style>
-  <w:style w:type="paragraph" w:styleId="831">
+  <w:style w:type="paragraph" w:styleId="847">
     <w:name w:val="Heading 5"/>
-    <w:basedOn w:val="886"/>
-    <w:next w:val="886"/>
-    <w:link w:val="841"/>
+    <w:basedOn w:val="902"/>
+    <w:next w:val="902"/>
+    <w:link w:val="857"/>
     <w:uiPriority w:val="9"/>
     <w:unhideWhenUsed/>
     <w:qFormat/>
@@ -32598,11 +32776,11 @@
       <w:color w:val="0f4761" w:themeColor="accent1" w:themeShade="BF"/>
     </w:rPr>
   </w:style>
-  <w:style w:type="paragraph" w:styleId="832">
+  <w:style w:type="paragraph" w:styleId="848">
     <w:name w:val="Heading 6"/>
-    <w:basedOn w:val="886"/>
-    <w:next w:val="886"/>
-    <w:link w:val="842"/>
+    <w:basedOn w:val="902"/>
+    <w:next w:val="902"/>
+    <w:link w:val="858"/>
     <w:uiPriority w:val="9"/>
     <w:unhideWhenUsed/>
     <w:qFormat/>
@@ -32621,11 +32799,11 @@
       <w:color w:val="595959" w:themeColor="text1" w:themeTint="A6"/>
     </w:rPr>
   </w:style>
-  <w:style w:type="paragraph" w:styleId="833">
+  <w:style w:type="paragraph" w:styleId="849">
     <w:name w:val="Heading 7"/>
-    <w:basedOn w:val="886"/>
-    <w:next w:val="886"/>
-    <w:link w:val="843"/>
+    <w:basedOn w:val="902"/>
+    <w:next w:val="902"/>
+    <w:link w:val="859"/>
     <w:uiPriority w:val="9"/>
     <w:unhideWhenUsed/>
     <w:qFormat/>
@@ -32642,11 +32820,11 @@
       <w:color w:val="595959" w:themeColor="text1" w:themeTint="A6"/>
     </w:rPr>
   </w:style>
-  <w:style w:type="paragraph" w:styleId="834">
+  <w:style w:type="paragraph" w:styleId="850">
     <w:name w:val="Heading 8"/>
-    <w:basedOn w:val="886"/>
-    <w:next w:val="886"/>
-    <w:link w:val="844"/>
+    <w:basedOn w:val="902"/>
+    <w:next w:val="902"/>
+    <w:link w:val="860"/>
     <w:uiPriority w:val="9"/>
     <w:unhideWhenUsed/>
     <w:qFormat/>
@@ -32665,11 +32843,11 @@
       <w:color w:val="272727" w:themeColor="text1" w:themeTint="D8"/>
     </w:rPr>
   </w:style>
-  <w:style w:type="paragraph" w:styleId="835">
+  <w:style w:type="paragraph" w:styleId="851">
     <w:name w:val="Heading 9"/>
-    <w:basedOn w:val="886"/>
-    <w:next w:val="886"/>
-    <w:link w:val="845"/>
+    <w:basedOn w:val="902"/>
+    <w:next w:val="902"/>
+    <w:link w:val="861"/>
     <w:uiPriority w:val="9"/>
     <w:unhideWhenUsed/>
     <w:qFormat/>
@@ -32688,7 +32866,7 @@
       <w:color w:val="272727" w:themeColor="text1" w:themeTint="D8"/>
     </w:rPr>
   </w:style>
-  <w:style w:type="character" w:styleId="836" w:default="1">
+  <w:style w:type="character" w:styleId="852" w:default="1">
     <w:name w:val="Default Paragraph Font"/>
     <w:uiPriority w:val="1"/>
     <w:semiHidden/>
@@ -32699,10 +32877,10 @@
       <w:ind/>
     </w:pPr>
   </w:style>
-  <w:style w:type="character" w:styleId="837">
+  <w:style w:type="character" w:styleId="853">
     <w:name w:val="Heading 1 Char"/>
-    <w:basedOn w:val="836"/>
-    <w:link w:val="827"/>
+    <w:basedOn w:val="852"/>
+    <w:link w:val="843"/>
     <w:uiPriority w:val="9"/>
     <w:pPr>
       <w:pBdr/>
@@ -32716,10 +32894,10 @@
       <w:szCs w:val="40"/>
     </w:rPr>
   </w:style>
-  <w:style w:type="character" w:styleId="838">
+  <w:style w:type="character" w:styleId="854">
     <w:name w:val="Heading 2 Char"/>
-    <w:basedOn w:val="836"/>
-    <w:link w:val="828"/>
+    <w:basedOn w:val="852"/>
+    <w:link w:val="844"/>
     <w:uiPriority w:val="9"/>
     <w:pPr>
       <w:pBdr/>
@@ -32733,10 +32911,10 @@
       <w:szCs w:val="32"/>
     </w:rPr>
   </w:style>
-  <w:style w:type="character" w:styleId="839">
+  <w:style w:type="character" w:styleId="855">
     <w:name w:val="Heading 3 Char"/>
-    <w:basedOn w:val="836"/>
-    <w:link w:val="829"/>
+    <w:basedOn w:val="852"/>
+    <w:link w:val="845"/>
     <w:uiPriority w:val="9"/>
     <w:pPr>
       <w:pBdr/>
@@ -32750,10 +32928,10 @@
       <w:szCs w:val="28"/>
     </w:rPr>
   </w:style>
-  <w:style w:type="character" w:styleId="840">
+  <w:style w:type="character" w:styleId="856">
     <w:name w:val="Heading 4 Char"/>
-    <w:basedOn w:val="836"/>
-    <w:link w:val="830"/>
+    <w:basedOn w:val="852"/>
+    <w:link w:val="846"/>
     <w:uiPriority w:val="9"/>
     <w:pPr>
       <w:pBdr/>
@@ -32767,10 +32945,10 @@
       <w:color w:val="0f4761" w:themeColor="accent1" w:themeShade="BF"/>
     </w:rPr>
   </w:style>
-  <w:style w:type="character" w:styleId="841">
+  <w:style w:type="character" w:styleId="857">
     <w:name w:val="Heading 5 Char"/>
-    <w:basedOn w:val="836"/>
-    <w:link w:val="831"/>
+    <w:basedOn w:val="852"/>
+    <w:link w:val="847"/>
     <w:uiPriority w:val="9"/>
     <w:pPr>
       <w:pBdr/>
@@ -32782,10 +32960,10 @@
       <w:color w:val="0f4761" w:themeColor="accent1" w:themeShade="BF"/>
     </w:rPr>
   </w:style>
-  <w:style w:type="character" w:styleId="842">
+  <w:style w:type="character" w:styleId="858">
     <w:name w:val="Heading 6 Char"/>
-    <w:basedOn w:val="836"/>
-    <w:link w:val="832"/>
+    <w:basedOn w:val="852"/>
+    <w:link w:val="848"/>
     <w:uiPriority w:val="9"/>
     <w:pPr>
       <w:pBdr/>
@@ -32799,10 +32977,10 @@
       <w:color w:val="595959" w:themeColor="text1" w:themeTint="A6"/>
     </w:rPr>
   </w:style>
-  <w:style w:type="character" w:styleId="843">
+  <w:style w:type="character" w:styleId="859">
     <w:name w:val="Heading 7 Char"/>
-    <w:basedOn w:val="836"/>
-    <w:link w:val="833"/>
+    <w:basedOn w:val="852"/>
+    <w:link w:val="849"/>
     <w:uiPriority w:val="9"/>
     <w:pPr>
       <w:pBdr/>
@@ -32814,10 +32992,10 @@
       <w:color w:val="595959" w:themeColor="text1" w:themeTint="A6"/>
     </w:rPr>
   </w:style>
-  <w:style w:type="character" w:styleId="844">
+  <w:style w:type="character" w:styleId="860">
     <w:name w:val="Heading 8 Char"/>
-    <w:basedOn w:val="836"/>
-    <w:link w:val="834"/>
+    <w:basedOn w:val="852"/>
+    <w:link w:val="850"/>
     <w:uiPriority w:val="9"/>
     <w:pPr>
       <w:pBdr/>
@@ -32831,10 +33009,10 @@
       <w:color w:val="272727" w:themeColor="text1" w:themeTint="D8"/>
     </w:rPr>
   </w:style>
-  <w:style w:type="character" w:styleId="845">
+  <w:style w:type="character" w:styleId="861">
     <w:name w:val="Heading 9 Char"/>
-    <w:basedOn w:val="836"/>
-    <w:link w:val="835"/>
+    <w:basedOn w:val="852"/>
+    <w:link w:val="851"/>
     <w:uiPriority w:val="9"/>
     <w:pPr>
       <w:pBdr/>
@@ -32848,11 +33026,11 @@
       <w:color w:val="272727" w:themeColor="text1" w:themeTint="D8"/>
     </w:rPr>
   </w:style>
-  <w:style w:type="paragraph" w:styleId="846">
+  <w:style w:type="paragraph" w:styleId="862">
     <w:name w:val="Title"/>
-    <w:basedOn w:val="886"/>
-    <w:next w:val="886"/>
-    <w:link w:val="847"/>
+    <w:basedOn w:val="902"/>
+    <w:next w:val="902"/>
+    <w:link w:val="863"/>
     <w:uiPriority w:val="10"/>
     <w:qFormat/>
     <w:pPr>
@@ -32868,10 +33046,10 @@
       <w:szCs w:val="56"/>
     </w:rPr>
   </w:style>
-  <w:style w:type="character" w:styleId="847">
+  <w:style w:type="character" w:styleId="863">
     <w:name w:val="Title Char"/>
-    <w:basedOn w:val="836"/>
-    <w:link w:val="846"/>
+    <w:basedOn w:val="852"/>
+    <w:link w:val="862"/>
     <w:uiPriority w:val="10"/>
     <w:pPr>
       <w:pBdr/>
@@ -32885,11 +33063,11 @@
       <w:szCs w:val="56"/>
     </w:rPr>
   </w:style>
-  <w:style w:type="paragraph" w:styleId="848">
+  <w:style w:type="paragraph" w:styleId="864">
     <w:name w:val="Subtitle"/>
-    <w:basedOn w:val="886"/>
-    <w:next w:val="886"/>
-    <w:link w:val="849"/>
+    <w:basedOn w:val="902"/>
+    <w:next w:val="902"/>
+    <w:link w:val="865"/>
     <w:uiPriority w:val="11"/>
     <w:qFormat/>
     <w:pPr>
@@ -32907,10 +33085,10 @@
       <w:szCs w:val="28"/>
     </w:rPr>
   </w:style>
-  <w:style w:type="character" w:styleId="849">
+  <w:style w:type="character" w:styleId="865">
     <w:name w:val="Subtitle Char"/>
-    <w:basedOn w:val="836"/>
-    <w:link w:val="848"/>
+    <w:basedOn w:val="852"/>
+    <w:link w:val="864"/>
     <w:uiPriority w:val="11"/>
     <w:pPr>
       <w:pBdr/>
@@ -32924,11 +33102,11 @@
       <w:szCs w:val="28"/>
     </w:rPr>
   </w:style>
-  <w:style w:type="paragraph" w:styleId="850">
+  <w:style w:type="paragraph" w:styleId="866">
     <w:name w:val="Quote"/>
-    <w:basedOn w:val="886"/>
-    <w:next w:val="886"/>
-    <w:link w:val="851"/>
+    <w:basedOn w:val="902"/>
+    <w:next w:val="902"/>
+    <w:link w:val="867"/>
     <w:uiPriority w:val="29"/>
     <w:qFormat/>
     <w:pPr>
@@ -32943,10 +33121,10 @@
       <w:color w:val="404040" w:themeColor="text1" w:themeTint="BF"/>
     </w:rPr>
   </w:style>
-  <w:style w:type="character" w:styleId="851">
+  <w:style w:type="character" w:styleId="867">
     <w:name w:val="Quote Char"/>
-    <w:basedOn w:val="836"/>
-    <w:link w:val="850"/>
+    <w:basedOn w:val="852"/>
+    <w:link w:val="866"/>
     <w:uiPriority w:val="29"/>
     <w:pPr>
       <w:pBdr/>
@@ -32959,9 +33137,9 @@
       <w:color w:val="404040" w:themeColor="text1" w:themeTint="BF"/>
     </w:rPr>
   </w:style>
-  <w:style w:type="character" w:styleId="852">
+  <w:style w:type="character" w:styleId="868">
     <w:name w:val="Intense Emphasis"/>
-    <w:basedOn w:val="836"/>
+    <w:basedOn w:val="852"/>
     <w:uiPriority w:val="21"/>
     <w:qFormat/>
     <w:pPr>
@@ -32975,11 +33153,11 @@
       <w:color w:val="0f4761" w:themeColor="accent1" w:themeShade="BF"/>
     </w:rPr>
   </w:style>
-  <w:style w:type="paragraph" w:styleId="853">
+  <w:style w:type="paragraph" w:styleId="869">
     <w:name w:val="Intense Quote"/>
-    <w:basedOn w:val="886"/>
-    <w:next w:val="886"/>
-    <w:link w:val="854"/>
+    <w:basedOn w:val="902"/>
+    <w:next w:val="902"/>
+    <w:link w:val="870"/>
     <w:uiPriority w:val="30"/>
     <w:qFormat/>
     <w:pPr>
@@ -32997,10 +33175,10 @@
       <w:color w:val="0f4761" w:themeColor="accent1" w:themeShade="BF"/>
     </w:rPr>
   </w:style>
-  <w:style w:type="character" w:styleId="854">
+  <w:style w:type="character" w:styleId="870">
     <w:name w:val="Intense Quote Char"/>
-    <w:basedOn w:val="836"/>
-    <w:link w:val="853"/>
+    <w:basedOn w:val="852"/>
+    <w:link w:val="869"/>
     <w:uiPriority w:val="30"/>
     <w:pPr>
       <w:pBdr/>
@@ -33013,9 +33191,9 @@
       <w:color w:val="0f4761" w:themeColor="accent1" w:themeShade="BF"/>
     </w:rPr>
   </w:style>
-  <w:style w:type="character" w:styleId="855">
+  <w:style w:type="character" w:styleId="871">
     <w:name w:val="Intense Reference"/>
-    <w:basedOn w:val="836"/>
+    <w:basedOn w:val="852"/>
     <w:uiPriority w:val="32"/>
     <w:qFormat/>
     <w:pPr>
@@ -33031,9 +33209,9 @@
       <w:spacing w:val="5"/>
     </w:rPr>
   </w:style>
-  <w:style w:type="character" w:styleId="856">
+  <w:style w:type="character" w:styleId="872">
     <w:name w:val="Subtle Emphasis"/>
-    <w:basedOn w:val="836"/>
+    <w:basedOn w:val="852"/>
     <w:uiPriority w:val="19"/>
     <w:qFormat/>
     <w:pPr>
@@ -33047,9 +33225,9 @@
       <w:color w:val="404040" w:themeColor="text1" w:themeTint="BF"/>
     </w:rPr>
   </w:style>
-  <w:style w:type="character" w:styleId="857">
+  <w:style w:type="character" w:styleId="873">
     <w:name w:val="Emphasis"/>
-    <w:basedOn w:val="836"/>
+    <w:basedOn w:val="852"/>
     <w:uiPriority w:val="20"/>
     <w:qFormat/>
     <w:pPr>
@@ -33062,9 +33240,9 @@
       <w:iCs/>
     </w:rPr>
   </w:style>
-  <w:style w:type="character" w:styleId="858">
+  <w:style w:type="character" w:styleId="874">
     <w:name w:val="Strong"/>
-    <w:basedOn w:val="836"/>
+    <w:basedOn w:val="852"/>
     <w:uiPriority w:val="22"/>
     <w:qFormat/>
     <w:pPr>
@@ -33077,9 +33255,9 @@
       <w:bCs/>
     </w:rPr>
   </w:style>
-  <w:style w:type="character" w:styleId="859">
+  <w:style w:type="character" w:styleId="875">
     <w:name w:val="Subtle Reference"/>
-    <w:basedOn w:val="836"/>
+    <w:basedOn w:val="852"/>
     <w:uiPriority w:val="31"/>
     <w:qFormat/>
     <w:pPr>
@@ -33092,9 +33270,9 @@
       <w:color w:val="5a5a5a" w:themeColor="text1" w:themeTint="A5"/>
     </w:rPr>
   </w:style>
-  <w:style w:type="character" w:styleId="860">
+  <w:style w:type="character" w:styleId="876">
     <w:name w:val="Book Title"/>
-    <w:basedOn w:val="836"/>
+    <w:basedOn w:val="852"/>
     <w:uiPriority w:val="33"/>
     <w:qFormat/>
     <w:pPr>
@@ -33110,10 +33288,10 @@
       <w:spacing w:val="5"/>
     </w:rPr>
   </w:style>
-  <w:style w:type="paragraph" w:styleId="861">
+  <w:style w:type="paragraph" w:styleId="877">
     <w:name w:val="Header"/>
-    <w:basedOn w:val="886"/>
-    <w:link w:val="862"/>
+    <w:basedOn w:val="902"/>
+    <w:link w:val="878"/>
     <w:uiPriority w:val="99"/>
     <w:unhideWhenUsed/>
     <w:pPr>
@@ -33126,10 +33304,10 @@
       <w:ind/>
     </w:pPr>
   </w:style>
-  <w:style w:type="character" w:styleId="862">
+  <w:style w:type="character" w:styleId="878">
     <w:name w:val="Header Char"/>
-    <w:basedOn w:val="836"/>
-    <w:link w:val="861"/>
+    <w:basedOn w:val="852"/>
+    <w:link w:val="877"/>
     <w:uiPriority w:val="99"/>
     <w:pPr>
       <w:pBdr/>
@@ -33137,10 +33315,10 @@
       <w:ind/>
     </w:pPr>
   </w:style>
-  <w:style w:type="paragraph" w:styleId="863">
+  <w:style w:type="paragraph" w:styleId="879">
     <w:name w:val="Footer"/>
-    <w:basedOn w:val="886"/>
-    <w:link w:val="864"/>
+    <w:basedOn w:val="902"/>
+    <w:link w:val="880"/>
     <w:uiPriority w:val="99"/>
     <w:unhideWhenUsed/>
     <w:pPr>
@@ -33153,10 +33331,10 @@
       <w:ind/>
     </w:pPr>
   </w:style>
-  <w:style w:type="character" w:styleId="864">
+  <w:style w:type="character" w:styleId="880">
     <w:name w:val="Footer Char"/>
-    <w:basedOn w:val="836"/>
-    <w:link w:val="863"/>
+    <w:basedOn w:val="852"/>
+    <w:link w:val="879"/>
     <w:uiPriority w:val="99"/>
     <w:pPr>
       <w:pBdr/>
@@ -33164,10 +33342,10 @@
       <w:ind/>
     </w:pPr>
   </w:style>
-  <w:style w:type="paragraph" w:styleId="865">
+  <w:style w:type="paragraph" w:styleId="881">
     <w:name w:val="Caption"/>
-    <w:basedOn w:val="886"/>
-    <w:next w:val="886"/>
+    <w:basedOn w:val="902"/>
+    <w:next w:val="902"/>
     <w:uiPriority w:val="35"/>
     <w:unhideWhenUsed/>
     <w:qFormat/>
@@ -33184,10 +33362,10 @@
       <w:szCs w:val="18"/>
     </w:rPr>
   </w:style>
-  <w:style w:type="paragraph" w:styleId="866">
+  <w:style w:type="paragraph" w:styleId="882">
     <w:name w:val="footnote text"/>
-    <w:basedOn w:val="886"/>
-    <w:link w:val="867"/>
+    <w:basedOn w:val="902"/>
+    <w:link w:val="883"/>
     <w:uiPriority w:val="99"/>
     <w:semiHidden/>
     <w:unhideWhenUsed/>
@@ -33201,10 +33379,10 @@
       <w:szCs w:val="20"/>
     </w:rPr>
   </w:style>
-  <w:style w:type="character" w:styleId="867">
+  <w:style w:type="character" w:styleId="883">
     <w:name w:val="Footnote Text Char"/>
-    <w:basedOn w:val="836"/>
-    <w:link w:val="866"/>
+    <w:basedOn w:val="852"/>
+    <w:link w:val="882"/>
     <w:uiPriority w:val="99"/>
     <w:semiHidden/>
     <w:pPr>
@@ -33217,9 +33395,9 @@
       <w:szCs w:val="20"/>
     </w:rPr>
   </w:style>
-  <w:style w:type="character" w:styleId="868">
+  <w:style w:type="character" w:styleId="884">
     <w:name w:val="footnote reference"/>
-    <w:basedOn w:val="836"/>
+    <w:basedOn w:val="852"/>
     <w:uiPriority w:val="99"/>
     <w:semiHidden/>
     <w:unhideWhenUsed/>
@@ -33232,10 +33410,10 @@
       <w:vertAlign w:val="superscript"/>
     </w:rPr>
   </w:style>
-  <w:style w:type="paragraph" w:styleId="869">
+  <w:style w:type="paragraph" w:styleId="885">
     <w:name w:val="endnote text"/>
-    <w:basedOn w:val="886"/>
-    <w:link w:val="870"/>
+    <w:basedOn w:val="902"/>
+    <w:link w:val="886"/>
     <w:uiPriority w:val="99"/>
     <w:semiHidden/>
     <w:unhideWhenUsed/>
@@ -33249,10 +33427,10 @@
       <w:szCs w:val="20"/>
     </w:rPr>
   </w:style>
-  <w:style w:type="character" w:styleId="870">
+  <w:style w:type="character" w:styleId="886">
     <w:name w:val="Endnote Text Char"/>
-    <w:basedOn w:val="836"/>
-    <w:link w:val="869"/>
+    <w:basedOn w:val="852"/>
+    <w:link w:val="885"/>
     <w:uiPriority w:val="99"/>
     <w:semiHidden/>
     <w:pPr>
@@ -33265,9 +33443,9 @@
       <w:szCs w:val="20"/>
     </w:rPr>
   </w:style>
-  <w:style w:type="character" w:styleId="871">
+  <w:style w:type="character" w:styleId="887">
     <w:name w:val="endnote reference"/>
-    <w:basedOn w:val="836"/>
+    <w:basedOn w:val="852"/>
     <w:uiPriority w:val="99"/>
     <w:semiHidden/>
     <w:unhideWhenUsed/>
@@ -33280,9 +33458,9 @@
       <w:vertAlign w:val="superscript"/>
     </w:rPr>
   </w:style>
-  <w:style w:type="character" w:styleId="872">
+  <w:style w:type="character" w:styleId="888">
     <w:name w:val="Hyperlink"/>
-    <w:basedOn w:val="836"/>
+    <w:basedOn w:val="852"/>
     <w:uiPriority w:val="99"/>
     <w:unhideWhenUsed/>
     <w:pPr>
@@ -33295,9 +33473,9 @@
       <w:u w:val="single"/>
     </w:rPr>
   </w:style>
-  <w:style w:type="character" w:styleId="873">
+  <w:style w:type="character" w:styleId="889">
     <w:name w:val="FollowedHyperlink"/>
-    <w:basedOn w:val="836"/>
+    <w:basedOn w:val="852"/>
     <w:uiPriority w:val="99"/>
     <w:semiHidden/>
     <w:unhideWhenUsed/>
@@ -33311,10 +33489,10 @@
       <w:u w:val="single"/>
     </w:rPr>
   </w:style>
-  <w:style w:type="paragraph" w:styleId="874">
+  <w:style w:type="paragraph" w:styleId="890">
     <w:name w:val="toc 1"/>
-    <w:basedOn w:val="886"/>
-    <w:next w:val="886"/>
+    <w:basedOn w:val="902"/>
+    <w:next w:val="902"/>
     <w:uiPriority w:val="39"/>
     <w:unhideWhenUsed/>
     <w:pPr>
@@ -33323,10 +33501,10 @@
       <w:ind/>
     </w:pPr>
   </w:style>
-  <w:style w:type="paragraph" w:styleId="875">
+  <w:style w:type="paragraph" w:styleId="891">
     <w:name w:val="toc 2"/>
-    <w:basedOn w:val="886"/>
-    <w:next w:val="886"/>
+    <w:basedOn w:val="902"/>
+    <w:next w:val="902"/>
     <w:uiPriority w:val="39"/>
     <w:unhideWhenUsed/>
     <w:pPr>
@@ -33335,10 +33513,10 @@
       <w:ind w:left="220"/>
     </w:pPr>
   </w:style>
-  <w:style w:type="paragraph" w:styleId="876">
+  <w:style w:type="paragraph" w:styleId="892">
     <w:name w:val="toc 3"/>
-    <w:basedOn w:val="886"/>
-    <w:next w:val="886"/>
+    <w:basedOn w:val="902"/>
+    <w:next w:val="902"/>
     <w:uiPriority w:val="39"/>
     <w:unhideWhenUsed/>
     <w:pPr>
@@ -33347,10 +33525,10 @@
       <w:ind w:left="440"/>
     </w:pPr>
   </w:style>
-  <w:style w:type="paragraph" w:styleId="877">
+  <w:style w:type="paragraph" w:styleId="893">
     <w:name w:val="toc 4"/>
-    <w:basedOn w:val="886"/>
-    <w:next w:val="886"/>
+    <w:basedOn w:val="902"/>
+    <w:next w:val="902"/>
     <w:uiPriority w:val="39"/>
     <w:unhideWhenUsed/>
     <w:pPr>
@@ -33359,10 +33537,10 @@
       <w:ind w:left="660"/>
     </w:pPr>
   </w:style>
-  <w:style w:type="paragraph" w:styleId="878">
+  <w:style w:type="paragraph" w:styleId="894">
     <w:name w:val="toc 5"/>
-    <w:basedOn w:val="886"/>
-    <w:next w:val="886"/>
+    <w:basedOn w:val="902"/>
+    <w:next w:val="902"/>
     <w:uiPriority w:val="39"/>
     <w:unhideWhenUsed/>
     <w:pPr>
@@ -33371,10 +33549,10 @@
       <w:ind w:left="880"/>
     </w:pPr>
   </w:style>
-  <w:style w:type="paragraph" w:styleId="879">
+  <w:style w:type="paragraph" w:styleId="895">
     <w:name w:val="toc 6"/>
-    <w:basedOn w:val="886"/>
-    <w:next w:val="886"/>
+    <w:basedOn w:val="902"/>
+    <w:next w:val="902"/>
     <w:uiPriority w:val="39"/>
     <w:unhideWhenUsed/>
     <w:pPr>
@@ -33383,10 +33561,10 @@
       <w:ind w:left="1100"/>
     </w:pPr>
   </w:style>
-  <w:style w:type="paragraph" w:styleId="880">
+  <w:style w:type="paragraph" w:styleId="896">
     <w:name w:val="toc 7"/>
-    <w:basedOn w:val="886"/>
-    <w:next w:val="886"/>
+    <w:basedOn w:val="902"/>
+    <w:next w:val="902"/>
     <w:uiPriority w:val="39"/>
     <w:unhideWhenUsed/>
     <w:pPr>
@@ -33395,10 +33573,10 @@
       <w:ind w:left="1320"/>
     </w:pPr>
   </w:style>
-  <w:style w:type="paragraph" w:styleId="881">
+  <w:style w:type="paragraph" w:styleId="897">
     <w:name w:val="toc 8"/>
-    <w:basedOn w:val="886"/>
-    <w:next w:val="886"/>
+    <w:basedOn w:val="902"/>
+    <w:next w:val="902"/>
     <w:uiPriority w:val="39"/>
     <w:unhideWhenUsed/>
     <w:pPr>
@@ -33407,10 +33585,10 @@
       <w:ind w:left="1540"/>
     </w:pPr>
   </w:style>
-  <w:style w:type="paragraph" w:styleId="882">
+  <w:style w:type="paragraph" w:styleId="898">
     <w:name w:val="toc 9"/>
-    <w:basedOn w:val="886"/>
-    <w:next w:val="886"/>
+    <w:basedOn w:val="902"/>
+    <w:next w:val="902"/>
     <w:uiPriority w:val="39"/>
     <w:unhideWhenUsed/>
     <w:pPr>
@@ -33419,9 +33597,9 @@
       <w:ind w:left="1760"/>
     </w:pPr>
   </w:style>
-  <w:style w:type="character" w:styleId="883">
+  <w:style w:type="character" w:styleId="899">
     <w:name w:val="Placeholder Text"/>
-    <w:basedOn w:val="836"/>
+    <w:basedOn w:val="852"/>
     <w:uiPriority w:val="99"/>
     <w:semiHidden/>
     <w:pPr>
@@ -33433,7 +33611,7 @@
       <w:color w:val="666666"/>
     </w:rPr>
   </w:style>
-  <w:style w:type="paragraph" w:styleId="884">
+  <w:style w:type="paragraph" w:styleId="900">
     <w:name w:val="TOC Heading"/>
     <w:uiPriority w:val="39"/>
     <w:unhideWhenUsed/>
@@ -33443,10 +33621,10 @@
       <w:ind/>
     </w:pPr>
   </w:style>
-  <w:style w:type="paragraph" w:styleId="885">
+  <w:style w:type="paragraph" w:styleId="901">
     <w:name w:val="table of figures"/>
-    <w:basedOn w:val="886"/>
-    <w:next w:val="886"/>
+    <w:basedOn w:val="902"/>
+    <w:next w:val="902"/>
     <w:uiPriority w:val="99"/>
     <w:unhideWhenUsed/>
     <w:pPr>
@@ -33455,7 +33633,7 @@
       <w:ind/>
     </w:pPr>
   </w:style>
-  <w:style w:type="paragraph" w:styleId="886" w:default="1">
+  <w:style w:type="paragraph" w:styleId="902" w:default="1">
     <w:name w:val="Normal"/>
     <w:qFormat/>
     <w:pPr>
@@ -33463,8 +33641,12 @@
       <w:spacing/>
       <w:ind/>
     </w:pPr>
+    <w:rPr>
+      <w:sz w:val="24"/>
+      <w:szCs w:val="24"/>
+    </w:rPr>
   </w:style>
-  <w:style w:type="table" w:styleId="887" w:default="1">
+  <w:style w:type="table" w:styleId="903" w:default="1">
     <w:name w:val="Normal Table"/>
     <w:uiPriority w:val="99"/>
     <w:semiHidden/>
@@ -33657,7 +33839,7 @@
       </w:tcPr>
     </w:tblStylePr>
   </w:style>
-  <w:style w:type="numbering" w:styleId="888" w:default="1">
+  <w:style w:type="numbering" w:styleId="904" w:default="1">
     <w:name w:val="No List"/>
     <w:uiPriority w:val="99"/>
     <w:semiHidden/>
@@ -33668,9 +33850,9 @@
       <w:ind/>
     </w:pPr>
   </w:style>
-  <w:style w:type="paragraph" w:styleId="889">
+  <w:style w:type="paragraph" w:styleId="905">
     <w:name w:val="No Spacing"/>
-    <w:basedOn w:val="886"/>
+    <w:basedOn w:val="902"/>
     <w:uiPriority w:val="1"/>
     <w:qFormat/>
     <w:pPr>
@@ -33679,9 +33861,9 @@
       <w:ind/>
     </w:pPr>
   </w:style>
-  <w:style w:type="paragraph" w:styleId="890">
+  <w:style w:type="paragraph" w:styleId="906">
     <w:name w:val="List Paragraph"/>
-    <w:basedOn w:val="886"/>
+    <w:basedOn w:val="902"/>
     <w:uiPriority w:val="34"/>
     <w:qFormat/>
     <w:pPr>

</xml_diff>